<commit_message>
fix luong su kien
</commit_message>
<xml_diff>
--- a/docs/BRD_CEO1983_YEU_CAU_NGHIEP_VU_TOAN_DIEN.docx
+++ b/docs/BRD_CEO1983_YEU_CAU_NGHIEP_VU_TOAN_DIEN.docx
@@ -84,7 +84,7 @@
           <w:sz w:val="22"/>
           <w:szCs w:val="22"/>
         </w:rPr>
-        <w:t xml:space="preserve">Mã Tài Liệu: BRD-CEO1983-MASTER-V5.0</w:t>
+        <w:t xml:space="preserve">Mã Tài Liệu: BRD-CEO1983-MASTER-V5.5</w:t>
       </w:r>
     </w:p>
     <w:p>
@@ -99,7 +99,7 @@
           <w:sz w:val="20"/>
           <w:szCs w:val="20"/>
         </w:rPr>
-        <w:t xml:space="preserve">Phiên Bản: Version 5.0 (Master Enterprise Release)</w:t>
+        <w:t xml:space="preserve">Phiên Bản: Version 5.5 (Master Enterprise Release - Tích Hợp Trợ Lý AI 32 Tính Năng &amp; GPS Tour)</w:t>
       </w:r>
     </w:p>
     <w:p>
@@ -114,7 +114,7 @@
           <w:sz w:val="20"/>
           <w:szCs w:val="20"/>
         </w:rPr>
-        <w:t xml:space="preserve">Ngày Phê Duyệt: 04/10/2026</w:t>
+        <w:t xml:space="preserve">Ngày Phê Duyệt: 06/10/2026</w:t>
       </w:r>
     </w:p>
     <w:p>
@@ -243,14 +243,16 @@
           <w:insideH w:val="single" w:color="auto" w:sz="4"/>
           <w:insideV w:val="single" w:color="auto" w:sz="4"/>
         </w:tblBorders>
+        <w:tblLayout w:type="fixed"/>
       </w:tblPr>
       <w:tblGrid>
-        <w:gridCol w:w="100"/>
-        <w:gridCol w:w="100"/>
-        <w:gridCol w:w="100"/>
+        <w:gridCol w:w="1000"/>
+        <w:gridCol w:w="3200"/>
+        <w:gridCol w:w="5000"/>
       </w:tblGrid>
       <w:tr>
         <w:trPr>
+          <w:cantSplit/>
           <w:tblHeader/>
         </w:trPr>
         <w:tc>
@@ -357,6 +359,9 @@
         </w:tc>
       </w:tr>
       <w:tr>
+        <w:trPr>
+          <w:cantSplit/>
+        </w:trPr>
         <w:tc>
           <w:tcPr>
             <w:tcW w:type="dxa" w:w="1000"/>
@@ -458,6 +463,9 @@
         </w:tc>
       </w:tr>
       <w:tr>
+        <w:trPr>
+          <w:cantSplit/>
+        </w:trPr>
         <w:tc>
           <w:tcPr>
             <w:tcW w:type="dxa" w:w="1000"/>
@@ -559,6 +567,9 @@
         </w:tc>
       </w:tr>
       <w:tr>
+        <w:trPr>
+          <w:cantSplit/>
+        </w:trPr>
         <w:tc>
           <w:tcPr>
             <w:tcW w:type="dxa" w:w="1000"/>
@@ -660,6 +671,9 @@
         </w:tc>
       </w:tr>
       <w:tr>
+        <w:trPr>
+          <w:cantSplit/>
+        </w:trPr>
         <w:tc>
           <w:tcPr>
             <w:tcW w:type="dxa" w:w="1000"/>
@@ -761,6 +775,9 @@
         </w:tc>
       </w:tr>
       <w:tr>
+        <w:trPr>
+          <w:cantSplit/>
+        </w:trPr>
         <w:tc>
           <w:tcPr>
             <w:tcW w:type="dxa" w:w="1000"/>
@@ -862,6 +879,9 @@
         </w:tc>
       </w:tr>
       <w:tr>
+        <w:trPr>
+          <w:cantSplit/>
+        </w:trPr>
         <w:tc>
           <w:tcPr>
             <w:tcW w:type="dxa" w:w="1000"/>
@@ -958,6 +978,110 @@
                 <w:szCs w:val="20"/>
               </w:rPr>
               <w:t xml:space="preserve">Hội viên có nhu cầu tiêu dùng chéo và tìm kiếm nhà cung cấp tin cậy trong nội bộ những người bạn đồng niên 1983 nhưng không có sàn thương mại B2B chính danh để niêm yết sản phẩm với chính sách ưu đãi đặc quyền. Đồng thời, nguồn tiền quyên góp Quỹ Thiện nguyện an sinh xã hội thiếu cơ chế công khai sao kê thời gian thực, chưa đáp ứng kỳ vọng minh bạch tuyệt đối của các nhà hảo tâm.</w:t>
+            </w:r>
+          </w:p>
+        </w:tc>
+      </w:tr>
+      <w:tr>
+        <w:trPr>
+          <w:cantSplit/>
+        </w:trPr>
+        <w:tc>
+          <w:tcPr>
+            <w:tcW w:type="dxa" w:w="1000"/>
+            <w:tcBorders>
+              <w:top w:val="single" w:color="CBD5E1" w:sz="4"/>
+              <w:left w:val="single" w:color="CBD5E1" w:sz="4"/>
+              <w:bottom w:val="single" w:color="CBD5E1" w:sz="4"/>
+              <w:right w:val="single" w:color="CBD5E1" w:sz="4"/>
+            </w:tcBorders>
+            <w:shd w:fill="FFFFFF" w:val="clear"/>
+            <w:tcMar>
+              <w:top w:type="dxa" w:w="100"/>
+              <w:left w:type="dxa" w:w="140"/>
+              <w:bottom w:type="dxa" w:w="100"/>
+              <w:right w:type="dxa" w:w="140"/>
+            </w:tcMar>
+          </w:tcPr>
+          <w:p>
+            <w:pPr>
+              <w:spacing w:after="25" w:before="25" w:line="240"/>
+              <w:jc w:val="left"/>
+            </w:pPr>
+            <w:r>
+              <w:rPr>
+                <w:rFonts w:ascii="Times New Roman" w:cs="Times New Roman" w:eastAsia="Times New Roman" w:hAnsi="Times New Roman"/>
+                <w:color w:val="1E293B"/>
+                <w:sz w:val="20"/>
+                <w:szCs w:val="20"/>
+              </w:rPr>
+              <w:t xml:space="preserve">PP-07</w:t>
+            </w:r>
+          </w:p>
+        </w:tc>
+        <w:tc>
+          <w:tcPr>
+            <w:tcW w:type="dxa" w:w="3200"/>
+            <w:tcBorders>
+              <w:top w:val="single" w:color="CBD5E1" w:sz="4"/>
+              <w:left w:val="single" w:color="CBD5E1" w:sz="4"/>
+              <w:bottom w:val="single" w:color="CBD5E1" w:sz="4"/>
+              <w:right w:val="single" w:color="CBD5E1" w:sz="4"/>
+            </w:tcBorders>
+            <w:shd w:fill="FFFFFF" w:val="clear"/>
+            <w:tcMar>
+              <w:top w:type="dxa" w:w="100"/>
+              <w:left w:type="dxa" w:w="140"/>
+              <w:bottom w:type="dxa" w:w="100"/>
+              <w:right w:type="dxa" w:w="140"/>
+            </w:tcMar>
+          </w:tcPr>
+          <w:p>
+            <w:pPr>
+              <w:spacing w:after="25" w:before="25" w:line="240"/>
+              <w:jc w:val="left"/>
+            </w:pPr>
+            <w:r>
+              <w:rPr>
+                <w:rFonts w:ascii="Times New Roman" w:cs="Times New Roman" w:eastAsia="Times New Roman" w:hAnsi="Times New Roman"/>
+                <w:color w:val="1E293B"/>
+                <w:sz w:val="20"/>
+                <w:szCs w:val="20"/>
+              </w:rPr>
+              <w:t xml:space="preserve">Hội Viên &amp; Cán Bộ Bỡ Ngỡ Trước 32+ Phân Hệ Tính Năng (Thiếu Trợ Lý Hướng Dẫn Tức Thời)</w:t>
+            </w:r>
+          </w:p>
+        </w:tc>
+        <w:tc>
+          <w:tcPr>
+            <w:tcW w:type="dxa" w:w="5000"/>
+            <w:tcBorders>
+              <w:top w:val="single" w:color="CBD5E1" w:sz="4"/>
+              <w:left w:val="single" w:color="CBD5E1" w:sz="4"/>
+              <w:bottom w:val="single" w:color="CBD5E1" w:sz="4"/>
+              <w:right w:val="single" w:color="CBD5E1" w:sz="4"/>
+            </w:tcBorders>
+            <w:shd w:fill="FFFFFF" w:val="clear"/>
+            <w:tcMar>
+              <w:top w:type="dxa" w:w="100"/>
+              <w:left w:type="dxa" w:w="140"/>
+              <w:bottom w:type="dxa" w:w="100"/>
+              <w:right w:type="dxa" w:w="140"/>
+            </w:tcMar>
+          </w:tcPr>
+          <w:p>
+            <w:pPr>
+              <w:spacing w:after="25" w:before="25" w:line="240"/>
+              <w:jc w:val="left"/>
+            </w:pPr>
+            <w:r>
+              <w:rPr>
+                <w:rFonts w:ascii="Times New Roman" w:cs="Times New Roman" w:eastAsia="Times New Roman" w:hAnsi="Times New Roman"/>
+                <w:color w:val="1E293B"/>
+                <w:sz w:val="20"/>
+                <w:szCs w:val="20"/>
+              </w:rPr>
+              <w:t xml:space="preserve">Hệ thống sở hữu hơn 32 phân hệ tính năng phức tạp từ quản trị sự kiện, soát vé QR/NFC, danh thiếp số AI OCR, sàn giao thương B2B, biểu quyết đại hội đến phân quyền RBAC và kế toán hội phí. Đa số doanh nhân CEO 1983 bận rộn và cán bộ văn phòng mới tiếp cận không có thời gian đọc cẩm nang hướng dẫn dài hàng trăm trang, thường xuyên gọi điện hỏi Ban Thư Ký về các thao tác cơ bản, gây quá tải bộ máy hành chính và giảm tỷ lệ tương tác với nền tảng số.</w:t>
             </w:r>
           </w:p>
         </w:tc>
@@ -991,14 +1115,16 @@
           <w:insideH w:val="single" w:color="auto" w:sz="4"/>
           <w:insideV w:val="single" w:color="auto" w:sz="4"/>
         </w:tblBorders>
+        <w:tblLayout w:type="fixed"/>
       </w:tblPr>
       <w:tblGrid>
-        <w:gridCol w:w="100"/>
-        <w:gridCol w:w="100"/>
-        <w:gridCol w:w="100"/>
+        <w:gridCol w:w="1200"/>
+        <w:gridCol w:w="3300"/>
+        <w:gridCol w:w="4700"/>
       </w:tblGrid>
       <w:tr>
         <w:trPr>
+          <w:cantSplit/>
           <w:tblHeader/>
         </w:trPr>
         <w:tc>
@@ -1105,6 +1231,9 @@
         </w:tc>
       </w:tr>
       <w:tr>
+        <w:trPr>
+          <w:cantSplit/>
+        </w:trPr>
         <w:tc>
           <w:tcPr>
             <w:tcW w:type="dxa" w:w="1200"/>
@@ -1206,6 +1335,9 @@
         </w:tc>
       </w:tr>
       <w:tr>
+        <w:trPr>
+          <w:cantSplit/>
+        </w:trPr>
         <w:tc>
           <w:tcPr>
             <w:tcW w:type="dxa" w:w="1200"/>
@@ -1307,6 +1439,9 @@
         </w:tc>
       </w:tr>
       <w:tr>
+        <w:trPr>
+          <w:cantSplit/>
+        </w:trPr>
         <w:tc>
           <w:tcPr>
             <w:tcW w:type="dxa" w:w="1200"/>
@@ -1408,6 +1543,9 @@
         </w:tc>
       </w:tr>
       <w:tr>
+        <w:trPr>
+          <w:cantSplit/>
+        </w:trPr>
         <w:tc>
           <w:tcPr>
             <w:tcW w:type="dxa" w:w="1200"/>
@@ -1509,6 +1647,9 @@
         </w:tc>
       </w:tr>
       <w:tr>
+        <w:trPr>
+          <w:cantSplit/>
+        </w:trPr>
         <w:tc>
           <w:tcPr>
             <w:tcW w:type="dxa" w:w="1200"/>
@@ -1610,6 +1751,9 @@
         </w:tc>
       </w:tr>
       <w:tr>
+        <w:trPr>
+          <w:cantSplit/>
+        </w:trPr>
         <w:tc>
           <w:tcPr>
             <w:tcW w:type="dxa" w:w="1200"/>
@@ -1706,6 +1850,110 @@
                 <w:szCs w:val="20"/>
               </w:rPr>
               <w:t xml:space="preserve">Áp dụng quy trình kiểm soát chi tiêu 3 cấp nghiêm ngặt; công khai sao kê quỹ thiện nguyện thời gian thực cho toàn thể hội viên.</w:t>
+            </w:r>
+          </w:p>
+        </w:tc>
+      </w:tr>
+      <w:tr>
+        <w:trPr>
+          <w:cantSplit/>
+        </w:trPr>
+        <w:tc>
+          <w:tcPr>
+            <w:tcW w:type="dxa" w:w="1200"/>
+            <w:tcBorders>
+              <w:top w:val="single" w:color="CBD5E1" w:sz="4"/>
+              <w:left w:val="single" w:color="CBD5E1" w:sz="4"/>
+              <w:bottom w:val="single" w:color="CBD5E1" w:sz="4"/>
+              <w:right w:val="single" w:color="CBD5E1" w:sz="4"/>
+            </w:tcBorders>
+            <w:shd w:fill="FFFFFF" w:val="clear"/>
+            <w:tcMar>
+              <w:top w:type="dxa" w:w="100"/>
+              <w:left w:type="dxa" w:w="140"/>
+              <w:bottom w:type="dxa" w:w="100"/>
+              <w:right w:type="dxa" w:w="140"/>
+            </w:tcMar>
+          </w:tcPr>
+          <w:p>
+            <w:pPr>
+              <w:spacing w:after="25" w:before="25" w:line="240"/>
+              <w:jc w:val="left"/>
+            </w:pPr>
+            <w:r>
+              <w:rPr>
+                <w:rFonts w:ascii="Times New Roman" w:cs="Times New Roman" w:eastAsia="Times New Roman" w:hAnsi="Times New Roman"/>
+                <w:color w:val="1E293B"/>
+                <w:sz w:val="20"/>
+                <w:szCs w:val="20"/>
+              </w:rPr>
+              <w:t xml:space="preserve">OBJ-07</w:t>
+            </w:r>
+          </w:p>
+        </w:tc>
+        <w:tc>
+          <w:tcPr>
+            <w:tcW w:type="dxa" w:w="3300"/>
+            <w:tcBorders>
+              <w:top w:val="single" w:color="CBD5E1" w:sz="4"/>
+              <w:left w:val="single" w:color="CBD5E1" w:sz="4"/>
+              <w:bottom w:val="single" w:color="CBD5E1" w:sz="4"/>
+              <w:right w:val="single" w:color="CBD5E1" w:sz="4"/>
+            </w:tcBorders>
+            <w:shd w:fill="FFFFFF" w:val="clear"/>
+            <w:tcMar>
+              <w:top w:type="dxa" w:w="100"/>
+              <w:left w:type="dxa" w:w="140"/>
+              <w:bottom w:type="dxa" w:w="100"/>
+              <w:right w:type="dxa" w:w="140"/>
+            </w:tcMar>
+          </w:tcPr>
+          <w:p>
+            <w:pPr>
+              <w:spacing w:after="25" w:before="25" w:line="240"/>
+              <w:jc w:val="left"/>
+            </w:pPr>
+            <w:r>
+              <w:rPr>
+                <w:rFonts w:ascii="Times New Roman" w:cs="Times New Roman" w:eastAsia="Times New Roman" w:hAnsi="Times New Roman"/>
+                <w:color w:val="1E293B"/>
+                <w:sz w:val="20"/>
+                <w:szCs w:val="20"/>
+              </w:rPr>
+              <w:t xml:space="preserve">Trợ Lý AI Điều Hành 100% Miễn Phí &amp; Chỉ Dẫn Thao Tác Trực Tiếp 32/32 Tính Năng</w:t>
+            </w:r>
+          </w:p>
+        </w:tc>
+        <w:tc>
+          <w:tcPr>
+            <w:tcW w:type="dxa" w:w="4700"/>
+            <w:tcBorders>
+              <w:top w:val="single" w:color="CBD5E1" w:sz="4"/>
+              <w:left w:val="single" w:color="CBD5E1" w:sz="4"/>
+              <w:bottom w:val="single" w:color="CBD5E1" w:sz="4"/>
+              <w:right w:val="single" w:color="CBD5E1" w:sz="4"/>
+            </w:tcBorders>
+            <w:shd w:fill="FFFFFF" w:val="clear"/>
+            <w:tcMar>
+              <w:top w:type="dxa" w:w="100"/>
+              <w:left w:type="dxa" w:w="140"/>
+              <w:bottom w:type="dxa" w:w="100"/>
+              <w:right w:type="dxa" w:w="140"/>
+            </w:tcMar>
+          </w:tcPr>
+          <w:p>
+            <w:pPr>
+              <w:spacing w:after="25" w:before="25" w:line="240"/>
+              <w:jc w:val="left"/>
+            </w:pPr>
+            <w:r>
+              <w:rPr>
+                <w:rFonts w:ascii="Times New Roman" w:cs="Times New Roman" w:eastAsia="Times New Roman" w:hAnsi="Times New Roman"/>
+                <w:color w:val="1E293B"/>
+                <w:sz w:val="20"/>
+                <w:szCs w:val="20"/>
+              </w:rPr>
+              <w:t xml:space="preserve">Tích hợp Google Gemini 2.0 Flash Free Tier kết hợp giọng nói tiếng Việt Web Speech API vi-VN và Smart Hybrid Engine nội bộ; tự động nắm bắt 100% phiên đăng nhập thời gian thực và dẫn đường GPS Turn-by-Turn HUD cho 32 tính năng (trong/ngoài) khi người dùng bấm hoặc nói 'Có', giải quyết 99% thắc mắc thao tác tức thời.</w:t>
             </w:r>
           </w:p>
         </w:tc>
@@ -1966,11 +2214,15 @@
           <w:insideH w:val="single" w:color="auto" w:sz="4"/>
           <w:insideV w:val="single" w:color="auto" w:sz="4"/>
         </w:tblBorders>
+        <w:tblLayout w:type="fixed"/>
       </w:tblPr>
       <w:tblGrid>
-        <w:gridCol w:w="100"/>
+        <w:gridCol w:w="9200"/>
       </w:tblGrid>
       <w:tr>
+        <w:trPr>
+          <w:cantSplit/>
+        </w:trPr>
         <w:tc>
           <w:tcPr>
             <w:tcW w:type="dxa" w:w="9200"/>
@@ -2512,20 +2764,22 @@
           <w:insideH w:val="single" w:color="auto" w:sz="4"/>
           <w:insideV w:val="single" w:color="auto" w:sz="4"/>
         </w:tblBorders>
+        <w:tblLayout w:type="fixed"/>
       </w:tblPr>
       <w:tblGrid>
-        <w:gridCol w:w="100"/>
-        <w:gridCol w:w="100"/>
-        <w:gridCol w:w="100"/>
-        <w:gridCol w:w="100"/>
-        <w:gridCol w:w="100"/>
-        <w:gridCol w:w="100"/>
-        <w:gridCol w:w="100"/>
-        <w:gridCol w:w="100"/>
-        <w:gridCol w:w="100"/>
+        <w:gridCol w:w="800"/>
+        <w:gridCol w:w="3600"/>
+        <w:gridCol w:w="600"/>
+        <w:gridCol w:w="700"/>
+        <w:gridCol w:w="700"/>
+        <w:gridCol w:w="700"/>
+        <w:gridCol w:w="700"/>
+        <w:gridCol w:w="700"/>
+        <w:gridCol w:w="700"/>
       </w:tblGrid>
       <w:tr>
         <w:trPr>
+          <w:cantSplit/>
           <w:tblHeader/>
         </w:trPr>
         <w:tc>
@@ -2836,6 +3090,9 @@
         </w:tc>
       </w:tr>
       <w:tr>
+        <w:trPr>
+          <w:cantSplit/>
+        </w:trPr>
         <w:tc>
           <w:tcPr>
             <w:tcW w:type="dxa" w:w="800"/>
@@ -3135,6 +3392,9 @@
         </w:tc>
       </w:tr>
       <w:tr>
+        <w:trPr>
+          <w:cantSplit/>
+        </w:trPr>
         <w:tc>
           <w:tcPr>
             <w:tcW w:type="dxa" w:w="800"/>
@@ -3434,6 +3694,9 @@
         </w:tc>
       </w:tr>
       <w:tr>
+        <w:trPr>
+          <w:cantSplit/>
+        </w:trPr>
         <w:tc>
           <w:tcPr>
             <w:tcW w:type="dxa" w:w="800"/>
@@ -3733,6 +3996,9 @@
         </w:tc>
       </w:tr>
       <w:tr>
+        <w:trPr>
+          <w:cantSplit/>
+        </w:trPr>
         <w:tc>
           <w:tcPr>
             <w:tcW w:type="dxa" w:w="800"/>
@@ -4032,6 +4298,9 @@
         </w:tc>
       </w:tr>
       <w:tr>
+        <w:trPr>
+          <w:cantSplit/>
+        </w:trPr>
         <w:tc>
           <w:tcPr>
             <w:tcW w:type="dxa" w:w="800"/>
@@ -4331,6 +4600,9 @@
         </w:tc>
       </w:tr>
       <w:tr>
+        <w:trPr>
+          <w:cantSplit/>
+        </w:trPr>
         <w:tc>
           <w:tcPr>
             <w:tcW w:type="dxa" w:w="800"/>
@@ -4630,6 +4902,9 @@
         </w:tc>
       </w:tr>
       <w:tr>
+        <w:trPr>
+          <w:cantSplit/>
+        </w:trPr>
         <w:tc>
           <w:tcPr>
             <w:tcW w:type="dxa" w:w="800"/>
@@ -4929,6 +5204,9 @@
         </w:tc>
       </w:tr>
       <w:tr>
+        <w:trPr>
+          <w:cantSplit/>
+        </w:trPr>
         <w:tc>
           <w:tcPr>
             <w:tcW w:type="dxa" w:w="800"/>
@@ -5228,6 +5506,9 @@
         </w:tc>
       </w:tr>
       <w:tr>
+        <w:trPr>
+          <w:cantSplit/>
+        </w:trPr>
         <w:tc>
           <w:tcPr>
             <w:tcW w:type="dxa" w:w="800"/>
@@ -5527,6 +5808,9 @@
         </w:tc>
       </w:tr>
       <w:tr>
+        <w:trPr>
+          <w:cantSplit/>
+        </w:trPr>
         <w:tc>
           <w:tcPr>
             <w:tcW w:type="dxa" w:w="800"/>
@@ -5826,6 +6110,9 @@
         </w:tc>
       </w:tr>
       <w:tr>
+        <w:trPr>
+          <w:cantSplit/>
+        </w:trPr>
         <w:tc>
           <w:tcPr>
             <w:tcW w:type="dxa" w:w="800"/>
@@ -6125,6 +6412,9 @@
         </w:tc>
       </w:tr>
       <w:tr>
+        <w:trPr>
+          <w:cantSplit/>
+        </w:trPr>
         <w:tc>
           <w:tcPr>
             <w:tcW w:type="dxa" w:w="800"/>
@@ -6424,6 +6714,9 @@
         </w:tc>
       </w:tr>
       <w:tr>
+        <w:trPr>
+          <w:cantSplit/>
+        </w:trPr>
         <w:tc>
           <w:tcPr>
             <w:tcW w:type="dxa" w:w="800"/>
@@ -6723,6 +7016,9 @@
         </w:tc>
       </w:tr>
       <w:tr>
+        <w:trPr>
+          <w:cantSplit/>
+        </w:trPr>
         <w:tc>
           <w:tcPr>
             <w:tcW w:type="dxa" w:w="800"/>
@@ -7022,6 +7318,9 @@
         </w:tc>
       </w:tr>
       <w:tr>
+        <w:trPr>
+          <w:cantSplit/>
+        </w:trPr>
         <w:tc>
           <w:tcPr>
             <w:tcW w:type="dxa" w:w="800"/>
@@ -7321,6 +7620,9 @@
         </w:tc>
       </w:tr>
       <w:tr>
+        <w:trPr>
+          <w:cantSplit/>
+        </w:trPr>
         <w:tc>
           <w:tcPr>
             <w:tcW w:type="dxa" w:w="800"/>
@@ -7684,14 +7986,16 @@
           <w:insideH w:val="single" w:color="auto" w:sz="4"/>
           <w:insideV w:val="single" w:color="auto" w:sz="4"/>
         </w:tblBorders>
+        <w:tblLayout w:type="fixed"/>
       </w:tblPr>
       <w:tblGrid>
-        <w:gridCol w:w="100"/>
-        <w:gridCol w:w="100"/>
-        <w:gridCol w:w="100"/>
+        <w:gridCol w:w="800"/>
+        <w:gridCol w:w="2600"/>
+        <w:gridCol w:w="5800"/>
       </w:tblGrid>
       <w:tr>
         <w:trPr>
+          <w:cantSplit/>
           <w:tblHeader/>
         </w:trPr>
         <w:tc>
@@ -7798,6 +8102,9 @@
         </w:tc>
       </w:tr>
       <w:tr>
+        <w:trPr>
+          <w:cantSplit/>
+        </w:trPr>
         <w:tc>
           <w:tcPr>
             <w:tcW w:type="dxa" w:w="800"/>
@@ -7899,6 +8206,9 @@
         </w:tc>
       </w:tr>
       <w:tr>
+        <w:trPr>
+          <w:cantSplit/>
+        </w:trPr>
         <w:tc>
           <w:tcPr>
             <w:tcW w:type="dxa" w:w="800"/>
@@ -8000,6 +8310,9 @@
         </w:tc>
       </w:tr>
       <w:tr>
+        <w:trPr>
+          <w:cantSplit/>
+        </w:trPr>
         <w:tc>
           <w:tcPr>
             <w:tcW w:type="dxa" w:w="800"/>
@@ -8101,6 +8414,9 @@
         </w:tc>
       </w:tr>
       <w:tr>
+        <w:trPr>
+          <w:cantSplit/>
+        </w:trPr>
         <w:tc>
           <w:tcPr>
             <w:tcW w:type="dxa" w:w="800"/>
@@ -8202,6 +8518,9 @@
         </w:tc>
       </w:tr>
       <w:tr>
+        <w:trPr>
+          <w:cantSplit/>
+        </w:trPr>
         <w:tc>
           <w:tcPr>
             <w:tcW w:type="dxa" w:w="800"/>
@@ -8350,14 +8669,16 @@
           <w:insideH w:val="single" w:color="auto" w:sz="4"/>
           <w:insideV w:val="single" w:color="auto" w:sz="4"/>
         </w:tblBorders>
+        <w:tblLayout w:type="fixed"/>
       </w:tblPr>
       <w:tblGrid>
-        <w:gridCol w:w="100"/>
-        <w:gridCol w:w="100"/>
-        <w:gridCol w:w="100"/>
+        <w:gridCol w:w="800"/>
+        <w:gridCol w:w="2600"/>
+        <w:gridCol w:w="5800"/>
       </w:tblGrid>
       <w:tr>
         <w:trPr>
+          <w:cantSplit/>
           <w:tblHeader/>
         </w:trPr>
         <w:tc>
@@ -8464,6 +8785,9 @@
         </w:tc>
       </w:tr>
       <w:tr>
+        <w:trPr>
+          <w:cantSplit/>
+        </w:trPr>
         <w:tc>
           <w:tcPr>
             <w:tcW w:type="dxa" w:w="800"/>
@@ -8565,6 +8889,9 @@
         </w:tc>
       </w:tr>
       <w:tr>
+        <w:trPr>
+          <w:cantSplit/>
+        </w:trPr>
         <w:tc>
           <w:tcPr>
             <w:tcW w:type="dxa" w:w="800"/>
@@ -8666,6 +8993,9 @@
         </w:tc>
       </w:tr>
       <w:tr>
+        <w:trPr>
+          <w:cantSplit/>
+        </w:trPr>
         <w:tc>
           <w:tcPr>
             <w:tcW w:type="dxa" w:w="800"/>
@@ -8767,6 +9097,9 @@
         </w:tc>
       </w:tr>
       <w:tr>
+        <w:trPr>
+          <w:cantSplit/>
+        </w:trPr>
         <w:tc>
           <w:tcPr>
             <w:tcW w:type="dxa" w:w="800"/>
@@ -8868,6 +9201,9 @@
         </w:tc>
       </w:tr>
       <w:tr>
+        <w:trPr>
+          <w:cantSplit/>
+        </w:trPr>
         <w:tc>
           <w:tcPr>
             <w:tcW w:type="dxa" w:w="800"/>
@@ -9016,14 +9352,16 @@
           <w:insideH w:val="single" w:color="auto" w:sz="4"/>
           <w:insideV w:val="single" w:color="auto" w:sz="4"/>
         </w:tblBorders>
+        <w:tblLayout w:type="fixed"/>
       </w:tblPr>
       <w:tblGrid>
-        <w:gridCol w:w="100"/>
-        <w:gridCol w:w="100"/>
-        <w:gridCol w:w="100"/>
+        <w:gridCol w:w="800"/>
+        <w:gridCol w:w="2600"/>
+        <w:gridCol w:w="5800"/>
       </w:tblGrid>
       <w:tr>
         <w:trPr>
+          <w:cantSplit/>
           <w:tblHeader/>
         </w:trPr>
         <w:tc>
@@ -9130,6 +9468,9 @@
         </w:tc>
       </w:tr>
       <w:tr>
+        <w:trPr>
+          <w:cantSplit/>
+        </w:trPr>
         <w:tc>
           <w:tcPr>
             <w:tcW w:type="dxa" w:w="800"/>
@@ -9231,6 +9572,9 @@
         </w:tc>
       </w:tr>
       <w:tr>
+        <w:trPr>
+          <w:cantSplit/>
+        </w:trPr>
         <w:tc>
           <w:tcPr>
             <w:tcW w:type="dxa" w:w="800"/>
@@ -9332,6 +9676,9 @@
         </w:tc>
       </w:tr>
       <w:tr>
+        <w:trPr>
+          <w:cantSplit/>
+        </w:trPr>
         <w:tc>
           <w:tcPr>
             <w:tcW w:type="dxa" w:w="800"/>
@@ -9433,6 +9780,9 @@
         </w:tc>
       </w:tr>
       <w:tr>
+        <w:trPr>
+          <w:cantSplit/>
+        </w:trPr>
         <w:tc>
           <w:tcPr>
             <w:tcW w:type="dxa" w:w="800"/>
@@ -9534,6 +9884,9 @@
         </w:tc>
       </w:tr>
       <w:tr>
+        <w:trPr>
+          <w:cantSplit/>
+        </w:trPr>
         <w:tc>
           <w:tcPr>
             <w:tcW w:type="dxa" w:w="800"/>
@@ -9682,14 +10035,16 @@
           <w:insideH w:val="single" w:color="auto" w:sz="4"/>
           <w:insideV w:val="single" w:color="auto" w:sz="4"/>
         </w:tblBorders>
+        <w:tblLayout w:type="fixed"/>
       </w:tblPr>
       <w:tblGrid>
-        <w:gridCol w:w="100"/>
-        <w:gridCol w:w="100"/>
-        <w:gridCol w:w="100"/>
+        <w:gridCol w:w="800"/>
+        <w:gridCol w:w="2600"/>
+        <w:gridCol w:w="5800"/>
       </w:tblGrid>
       <w:tr>
         <w:trPr>
+          <w:cantSplit/>
           <w:tblHeader/>
         </w:trPr>
         <w:tc>
@@ -9796,6 +10151,9 @@
         </w:tc>
       </w:tr>
       <w:tr>
+        <w:trPr>
+          <w:cantSplit/>
+        </w:trPr>
         <w:tc>
           <w:tcPr>
             <w:tcW w:type="dxa" w:w="800"/>
@@ -9897,6 +10255,9 @@
         </w:tc>
       </w:tr>
       <w:tr>
+        <w:trPr>
+          <w:cantSplit/>
+        </w:trPr>
         <w:tc>
           <w:tcPr>
             <w:tcW w:type="dxa" w:w="800"/>
@@ -9998,6 +10359,9 @@
         </w:tc>
       </w:tr>
       <w:tr>
+        <w:trPr>
+          <w:cantSplit/>
+        </w:trPr>
         <w:tc>
           <w:tcPr>
             <w:tcW w:type="dxa" w:w="800"/>
@@ -10099,6 +10463,9 @@
         </w:tc>
       </w:tr>
       <w:tr>
+        <w:trPr>
+          <w:cantSplit/>
+        </w:trPr>
         <w:tc>
           <w:tcPr>
             <w:tcW w:type="dxa" w:w="800"/>
@@ -10200,6 +10567,9 @@
         </w:tc>
       </w:tr>
       <w:tr>
+        <w:trPr>
+          <w:cantSplit/>
+        </w:trPr>
         <w:tc>
           <w:tcPr>
             <w:tcW w:type="dxa" w:w="800"/>
@@ -10329,14 +10699,16 @@
           <w:insideH w:val="single" w:color="auto" w:sz="4"/>
           <w:insideV w:val="single" w:color="auto" w:sz="4"/>
         </w:tblBorders>
+        <w:tblLayout w:type="fixed"/>
       </w:tblPr>
       <w:tblGrid>
-        <w:gridCol w:w="100"/>
-        <w:gridCol w:w="100"/>
-        <w:gridCol w:w="100"/>
+        <w:gridCol w:w="1600"/>
+        <w:gridCol w:w="2600"/>
+        <w:gridCol w:w="5000"/>
       </w:tblGrid>
       <w:tr>
         <w:trPr>
+          <w:cantSplit/>
           <w:tblHeader/>
         </w:trPr>
         <w:tc>
@@ -10443,6 +10815,9 @@
         </w:tc>
       </w:tr>
       <w:tr>
+        <w:trPr>
+          <w:cantSplit/>
+        </w:trPr>
         <w:tc>
           <w:tcPr>
             <w:tcW w:type="dxa" w:w="1600"/>
@@ -10544,6 +10919,9 @@
         </w:tc>
       </w:tr>
       <w:tr>
+        <w:trPr>
+          <w:cantSplit/>
+        </w:trPr>
         <w:tc>
           <w:tcPr>
             <w:tcW w:type="dxa" w:w="1600"/>
@@ -10645,6 +11023,9 @@
         </w:tc>
       </w:tr>
       <w:tr>
+        <w:trPr>
+          <w:cantSplit/>
+        </w:trPr>
         <w:tc>
           <w:tcPr>
             <w:tcW w:type="dxa" w:w="1600"/>
@@ -10746,6 +11127,9 @@
         </w:tc>
       </w:tr>
       <w:tr>
+        <w:trPr>
+          <w:cantSplit/>
+        </w:trPr>
         <w:tc>
           <w:tcPr>
             <w:tcW w:type="dxa" w:w="1600"/>
@@ -10847,6 +11231,9 @@
         </w:tc>
       </w:tr>
       <w:tr>
+        <w:trPr>
+          <w:cantSplit/>
+        </w:trPr>
         <w:tc>
           <w:tcPr>
             <w:tcW w:type="dxa" w:w="1600"/>
@@ -10948,6 +11335,9 @@
         </w:tc>
       </w:tr>
       <w:tr>
+        <w:trPr>
+          <w:cantSplit/>
+        </w:trPr>
         <w:tc>
           <w:tcPr>
             <w:tcW w:type="dxa" w:w="1600"/>
@@ -11049,6 +11439,9 @@
         </w:tc>
       </w:tr>
       <w:tr>
+        <w:trPr>
+          <w:cantSplit/>
+        </w:trPr>
         <w:tc>
           <w:tcPr>
             <w:tcW w:type="dxa" w:w="1600"/>
@@ -11150,6 +11543,9 @@
         </w:tc>
       </w:tr>
       <w:tr>
+        <w:trPr>
+          <w:cantSplit/>
+        </w:trPr>
         <w:tc>
           <w:tcPr>
             <w:tcW w:type="dxa" w:w="1600"/>
@@ -11251,6 +11647,9 @@
         </w:tc>
       </w:tr>
       <w:tr>
+        <w:trPr>
+          <w:cantSplit/>
+        </w:trPr>
         <w:tc>
           <w:tcPr>
             <w:tcW w:type="dxa" w:w="1600"/>
@@ -11352,6 +11751,9 @@
         </w:tc>
       </w:tr>
       <w:tr>
+        <w:trPr>
+          <w:cantSplit/>
+        </w:trPr>
         <w:tc>
           <w:tcPr>
             <w:tcW w:type="dxa" w:w="1600"/>
@@ -11448,6 +11850,641 @@
                 <w:szCs w:val="20"/>
               </w:rPr>
               <w:t xml:space="preserve">Toàn bộ giao diện Web CRM và Mobile App bắt buộc tuân thủ hệ màu thương hiệu chính thức của CLB CEO 1983: Màu chủ đạo Xanh Navy `#003B95` đại diện cho bản lĩnh doanh nhân; Màu điểm xuyết Vàng Ánh Kim Amber Gold `#F59E0B` đại diện cho sự thịnh vượng và uy quyền. Tuyệt đối KHÔNG sử dụng màu đen thuần `#000000` cho các nút bấm chính (CTA Buttons).</w:t>
+            </w:r>
+          </w:p>
+        </w:tc>
+      </w:tr>
+      <w:tr>
+        <w:trPr>
+          <w:cantSplit/>
+        </w:trPr>
+        <w:tc>
+          <w:tcPr>
+            <w:tcW w:type="dxa" w:w="1600"/>
+            <w:tcBorders>
+              <w:top w:val="single" w:color="CBD5E1" w:sz="4"/>
+              <w:left w:val="single" w:color="CBD5E1" w:sz="4"/>
+              <w:bottom w:val="single" w:color="CBD5E1" w:sz="4"/>
+              <w:right w:val="single" w:color="CBD5E1" w:sz="4"/>
+            </w:tcBorders>
+            <w:shd w:fill="FFFFFF" w:val="clear"/>
+            <w:tcMar>
+              <w:top w:type="dxa" w:w="100"/>
+              <w:left w:type="dxa" w:w="140"/>
+              <w:bottom w:type="dxa" w:w="100"/>
+              <w:right w:type="dxa" w:w="140"/>
+            </w:tcMar>
+          </w:tcPr>
+          <w:p>
+            <w:pPr>
+              <w:spacing w:after="25" w:before="25" w:line="240"/>
+              <w:jc w:val="left"/>
+            </w:pPr>
+            <w:r>
+              <w:rPr>
+                <w:rFonts w:ascii="Times New Roman" w:cs="Times New Roman" w:eastAsia="Times New Roman" w:hAnsi="Times New Roman"/>
+                <w:color w:val="1E293B"/>
+                <w:sz w:val="20"/>
+                <w:szCs w:val="20"/>
+              </w:rPr>
+              <w:t xml:space="preserve">RULE-EVT-VENUE-CONFLICT</w:t>
+            </w:r>
+          </w:p>
+        </w:tc>
+        <w:tc>
+          <w:tcPr>
+            <w:tcW w:type="dxa" w:w="2600"/>
+            <w:tcBorders>
+              <w:top w:val="single" w:color="CBD5E1" w:sz="4"/>
+              <w:left w:val="single" w:color="CBD5E1" w:sz="4"/>
+              <w:bottom w:val="single" w:color="CBD5E1" w:sz="4"/>
+              <w:right w:val="single" w:color="CBD5E1" w:sz="4"/>
+            </w:tcBorders>
+            <w:shd w:fill="FFFFFF" w:val="clear"/>
+            <w:tcMar>
+              <w:top w:type="dxa" w:w="100"/>
+              <w:left w:type="dxa" w:w="140"/>
+              <w:bottom w:type="dxa" w:w="100"/>
+              <w:right w:type="dxa" w:w="140"/>
+            </w:tcMar>
+          </w:tcPr>
+          <w:p>
+            <w:pPr>
+              <w:spacing w:after="25" w:before="25" w:line="240"/>
+              <w:jc w:val="left"/>
+            </w:pPr>
+            <w:r>
+              <w:rPr>
+                <w:rFonts w:ascii="Times New Roman" w:cs="Times New Roman" w:eastAsia="Times New Roman" w:hAnsi="Times New Roman"/>
+                <w:color w:val="1E293B"/>
+                <w:sz w:val="20"/>
+                <w:szCs w:val="20"/>
+              </w:rPr>
+              <w:t xml:space="preserve">Quy Tắc Kiểm Tra Xung Đột Địa Điểm Tổ Chức Sự Kiện (Venue Conflict Validation)</w:t>
+            </w:r>
+          </w:p>
+        </w:tc>
+        <w:tc>
+          <w:tcPr>
+            <w:tcW w:type="dxa" w:w="5000"/>
+            <w:tcBorders>
+              <w:top w:val="single" w:color="CBD5E1" w:sz="4"/>
+              <w:left w:val="single" w:color="CBD5E1" w:sz="4"/>
+              <w:bottom w:val="single" w:color="CBD5E1" w:sz="4"/>
+              <w:right w:val="single" w:color="CBD5E1" w:sz="4"/>
+            </w:tcBorders>
+            <w:shd w:fill="FFFFFF" w:val="clear"/>
+            <w:tcMar>
+              <w:top w:type="dxa" w:w="100"/>
+              <w:left w:type="dxa" w:w="140"/>
+              <w:bottom w:type="dxa" w:w="100"/>
+              <w:right w:type="dxa" w:w="140"/>
+            </w:tcMar>
+          </w:tcPr>
+          <w:p>
+            <w:pPr>
+              <w:spacing w:after="25" w:before="25" w:line="240"/>
+              <w:jc w:val="left"/>
+            </w:pPr>
+            <w:r>
+              <w:rPr>
+                <w:rFonts w:ascii="Times New Roman" w:cs="Times New Roman" w:eastAsia="Times New Roman" w:hAnsi="Times New Roman"/>
+                <w:color w:val="1E293B"/>
+                <w:sz w:val="20"/>
+                <w:szCs w:val="20"/>
+              </w:rPr>
+              <w:t xml:space="preserve">Hệ thống cho phép nhiều sự kiện diễn ra trong cùng một khung thời gian nhưng BẮT BUỘC phải tổ chức ở các địa điểm vật lý khác nhau (hoặc hình thức trực tuyến Online). Nếu quản trị viên nhập địa điểm trùng khớp với một sự kiện khác đang hoạt động (`status != 'cancelled'`) trong cùng ngày/giờ, hệ thống bắt buộc chặn lưu và hiển thị thông báo chi tiết: 'Địa điểm này đang trùng với sự kiện [Tên sự kiện], sau thời gian [hh:mm dd/MM/yyyy] có thể đăng ký được' (với thời điểm rảnh được tự động tính toán bằng thời gian kết thúc của sự kiện đang chiếm chỗ cộng thêm 2 giờ đệm phục vụ công tác dọn dẹp hội trường).</w:t>
+            </w:r>
+          </w:p>
+        </w:tc>
+      </w:tr>
+      <w:tr>
+        <w:trPr>
+          <w:cantSplit/>
+        </w:trPr>
+        <w:tc>
+          <w:tcPr>
+            <w:tcW w:type="dxa" w:w="1600"/>
+            <w:tcBorders>
+              <w:top w:val="single" w:color="CBD5E1" w:sz="4"/>
+              <w:left w:val="single" w:color="CBD5E1" w:sz="4"/>
+              <w:bottom w:val="single" w:color="CBD5E1" w:sz="4"/>
+              <w:right w:val="single" w:color="CBD5E1" w:sz="4"/>
+            </w:tcBorders>
+            <w:shd w:fill="F8FAFC" w:val="clear"/>
+            <w:tcMar>
+              <w:top w:type="dxa" w:w="100"/>
+              <w:left w:type="dxa" w:w="140"/>
+              <w:bottom w:type="dxa" w:w="100"/>
+              <w:right w:type="dxa" w:w="140"/>
+            </w:tcMar>
+          </w:tcPr>
+          <w:p>
+            <w:pPr>
+              <w:spacing w:after="25" w:before="25" w:line="240"/>
+              <w:jc w:val="left"/>
+            </w:pPr>
+            <w:r>
+              <w:rPr>
+                <w:rFonts w:ascii="Times New Roman" w:cs="Times New Roman" w:eastAsia="Times New Roman" w:hAnsi="Times New Roman"/>
+                <w:color w:val="1E293B"/>
+                <w:sz w:val="20"/>
+                <w:szCs w:val="20"/>
+              </w:rPr>
+              <w:t xml:space="preserve">RULE-EVT-USER-OVERLAP-WARNING</w:t>
+            </w:r>
+          </w:p>
+        </w:tc>
+        <w:tc>
+          <w:tcPr>
+            <w:tcW w:type="dxa" w:w="2600"/>
+            <w:tcBorders>
+              <w:top w:val="single" w:color="CBD5E1" w:sz="4"/>
+              <w:left w:val="single" w:color="CBD5E1" w:sz="4"/>
+              <w:bottom w:val="single" w:color="CBD5E1" w:sz="4"/>
+              <w:right w:val="single" w:color="CBD5E1" w:sz="4"/>
+            </w:tcBorders>
+            <w:shd w:fill="F8FAFC" w:val="clear"/>
+            <w:tcMar>
+              <w:top w:type="dxa" w:w="100"/>
+              <w:left w:type="dxa" w:w="140"/>
+              <w:bottom w:type="dxa" w:w="100"/>
+              <w:right w:type="dxa" w:w="140"/>
+            </w:tcMar>
+          </w:tcPr>
+          <w:p>
+            <w:pPr>
+              <w:spacing w:after="25" w:before="25" w:line="240"/>
+              <w:jc w:val="left"/>
+            </w:pPr>
+            <w:r>
+              <w:rPr>
+                <w:rFonts w:ascii="Times New Roman" w:cs="Times New Roman" w:eastAsia="Times New Roman" w:hAnsi="Times New Roman"/>
+                <w:color w:val="1E293B"/>
+                <w:sz w:val="20"/>
+                <w:szCs w:val="20"/>
+              </w:rPr>
+              <w:t xml:space="preserve">Quy Tắc Cảnh Báo Trùng Khung Giờ Đăng Ký Sự Kiện Hội Viên (confirmOverlap)</w:t>
+            </w:r>
+          </w:p>
+        </w:tc>
+        <w:tc>
+          <w:tcPr>
+            <w:tcW w:type="dxa" w:w="5000"/>
+            <w:tcBorders>
+              <w:top w:val="single" w:color="CBD5E1" w:sz="4"/>
+              <w:left w:val="single" w:color="CBD5E1" w:sz="4"/>
+              <w:bottom w:val="single" w:color="CBD5E1" w:sz="4"/>
+              <w:right w:val="single" w:color="CBD5E1" w:sz="4"/>
+            </w:tcBorders>
+            <w:shd w:fill="F8FAFC" w:val="clear"/>
+            <w:tcMar>
+              <w:top w:type="dxa" w:w="100"/>
+              <w:left w:type="dxa" w:w="140"/>
+              <w:bottom w:type="dxa" w:w="100"/>
+              <w:right w:type="dxa" w:w="140"/>
+            </w:tcMar>
+          </w:tcPr>
+          <w:p>
+            <w:pPr>
+              <w:spacing w:after="25" w:before="25" w:line="240"/>
+              <w:jc w:val="left"/>
+            </w:pPr>
+            <w:r>
+              <w:rPr>
+                <w:rFonts w:ascii="Times New Roman" w:cs="Times New Roman" w:eastAsia="Times New Roman" w:hAnsi="Times New Roman"/>
+                <w:color w:val="1E293B"/>
+                <w:sz w:val="20"/>
+                <w:szCs w:val="20"/>
+              </w:rPr>
+              <w:t xml:space="preserve">Khi hội viên đăng ký một sự kiện mới có cùng thời gian diễn ra với một sự kiện khác mà hội viên đó đã đăng ký trước đó, hệ thống không chặn cứng mà BẮT BUỘC hiển thị hộp thoại cảnh báo xác nhận: 'Bạn đang đăng ký sự kiện [Tên sự kiện mới] cùng thời gian với sự kiện [Tên sự kiện cũ] ([Thời gian]). Bạn có chắc muốn đăng ký thêm không?'. Khi hội viên chủ động bấm 'Tiếp Tục Đăng Ký', client gửi kèm cờ `confirmOverlap: true` để backend phê duyệt lưu bản ghi.</w:t>
+            </w:r>
+          </w:p>
+        </w:tc>
+      </w:tr>
+      <w:tr>
+        <w:trPr>
+          <w:cantSplit/>
+        </w:trPr>
+        <w:tc>
+          <w:tcPr>
+            <w:tcW w:type="dxa" w:w="1600"/>
+            <w:tcBorders>
+              <w:top w:val="single" w:color="CBD5E1" w:sz="4"/>
+              <w:left w:val="single" w:color="CBD5E1" w:sz="4"/>
+              <w:bottom w:val="single" w:color="CBD5E1" w:sz="4"/>
+              <w:right w:val="single" w:color="CBD5E1" w:sz="4"/>
+            </w:tcBorders>
+            <w:shd w:fill="FFFFFF" w:val="clear"/>
+            <w:tcMar>
+              <w:top w:type="dxa" w:w="100"/>
+              <w:left w:type="dxa" w:w="140"/>
+              <w:bottom w:type="dxa" w:w="100"/>
+              <w:right w:type="dxa" w:w="140"/>
+            </w:tcMar>
+          </w:tcPr>
+          <w:p>
+            <w:pPr>
+              <w:spacing w:after="25" w:before="25" w:line="240"/>
+              <w:jc w:val="left"/>
+            </w:pPr>
+            <w:r>
+              <w:rPr>
+                <w:rFonts w:ascii="Times New Roman" w:cs="Times New Roman" w:eastAsia="Times New Roman" w:hAnsi="Times New Roman"/>
+                <w:color w:val="1E293B"/>
+                <w:sz w:val="20"/>
+                <w:szCs w:val="20"/>
+              </w:rPr>
+              <w:t xml:space="preserve">RULE-SMTP-FAIL-SUPPRESSION</w:t>
+            </w:r>
+          </w:p>
+        </w:tc>
+        <w:tc>
+          <w:tcPr>
+            <w:tcW w:type="dxa" w:w="2600"/>
+            <w:tcBorders>
+              <w:top w:val="single" w:color="CBD5E1" w:sz="4"/>
+              <w:left w:val="single" w:color="CBD5E1" w:sz="4"/>
+              <w:bottom w:val="single" w:color="CBD5E1" w:sz="4"/>
+              <w:right w:val="single" w:color="CBD5E1" w:sz="4"/>
+            </w:tcBorders>
+            <w:shd w:fill="FFFFFF" w:val="clear"/>
+            <w:tcMar>
+              <w:top w:type="dxa" w:w="100"/>
+              <w:left w:type="dxa" w:w="140"/>
+              <w:bottom w:type="dxa" w:w="100"/>
+              <w:right w:type="dxa" w:w="140"/>
+            </w:tcMar>
+          </w:tcPr>
+          <w:p>
+            <w:pPr>
+              <w:spacing w:after="25" w:before="25" w:line="240"/>
+              <w:jc w:val="left"/>
+            </w:pPr>
+            <w:r>
+              <w:rPr>
+                <w:rFonts w:ascii="Times New Roman" w:cs="Times New Roman" w:eastAsia="Times New Roman" w:hAnsi="Times New Roman"/>
+                <w:color w:val="1E293B"/>
+                <w:sz w:val="20"/>
+                <w:szCs w:val="20"/>
+              </w:rPr>
+              <w:t xml:space="preserve">Quy Tắc Kiểm Soát Thư Tín SMTP &amp; Khóa Gửi 1-Fail Suppression List</w:t>
+            </w:r>
+          </w:p>
+        </w:tc>
+        <w:tc>
+          <w:tcPr>
+            <w:tcW w:type="dxa" w:w="5000"/>
+            <w:tcBorders>
+              <w:top w:val="single" w:color="CBD5E1" w:sz="4"/>
+              <w:left w:val="single" w:color="CBD5E1" w:sz="4"/>
+              <w:bottom w:val="single" w:color="CBD5E1" w:sz="4"/>
+              <w:right w:val="single" w:color="CBD5E1" w:sz="4"/>
+            </w:tcBorders>
+            <w:shd w:fill="FFFFFF" w:val="clear"/>
+            <w:tcMar>
+              <w:top w:type="dxa" w:w="100"/>
+              <w:left w:type="dxa" w:w="140"/>
+              <w:bottom w:type="dxa" w:w="100"/>
+              <w:right w:type="dxa" w:w="140"/>
+            </w:tcMar>
+          </w:tcPr>
+          <w:p>
+            <w:pPr>
+              <w:spacing w:after="25" w:before="25" w:line="240"/>
+              <w:jc w:val="left"/>
+            </w:pPr>
+            <w:r>
+              <w:rPr>
+                <w:rFonts w:ascii="Times New Roman" w:cs="Times New Roman" w:eastAsia="Times New Roman" w:hAnsi="Times New Roman"/>
+                <w:color w:val="1E293B"/>
+                <w:sz w:val="20"/>
+                <w:szCs w:val="20"/>
+              </w:rPr>
+              <w:t xml:space="preserve">Máy chủ dịch vụ thư điện tử (SMTP Relay) phải chủ động lọc và bỏ qua các địa chỉ hòm thư giả lập, kiểm thử nội bộ (`@ceo1983.com`, `test`, `dummy`). Đối với các email hội viên thực tế, nếu gửi thất bại ngay lần đầu (mã lỗi 5xx, Recipient Rejected, Mailbox Unavailable), hệ thống lập tức đưa email đó vào Danh Sách Chặn (Suppression List - lưu trữ tại `uploads/mail_suppression_list.json`) và TUYỆT ĐỐI KHÔNG thử lại lần thứ 2, nhằm triệt tiêu hoàn toàn vòng lặp thử lại vô hạn 47 giờ gây quá tải hạ tầng và rủi ro bị khóa tài khoản Google Mailer-Daemon.</w:t>
+            </w:r>
+          </w:p>
+        </w:tc>
+      </w:tr>
+      <w:tr>
+        <w:trPr>
+          <w:cantSplit/>
+        </w:trPr>
+        <w:tc>
+          <w:tcPr>
+            <w:tcW w:type="dxa" w:w="1600"/>
+            <w:tcBorders>
+              <w:top w:val="single" w:color="CBD5E1" w:sz="4"/>
+              <w:left w:val="single" w:color="CBD5E1" w:sz="4"/>
+              <w:bottom w:val="single" w:color="CBD5E1" w:sz="4"/>
+              <w:right w:val="single" w:color="CBD5E1" w:sz="4"/>
+            </w:tcBorders>
+            <w:shd w:fill="F8FAFC" w:val="clear"/>
+            <w:tcMar>
+              <w:top w:type="dxa" w:w="100"/>
+              <w:left w:type="dxa" w:w="140"/>
+              <w:bottom w:type="dxa" w:w="100"/>
+              <w:right w:type="dxa" w:w="140"/>
+            </w:tcMar>
+          </w:tcPr>
+          <w:p>
+            <w:pPr>
+              <w:spacing w:after="25" w:before="25" w:line="240"/>
+              <w:jc w:val="left"/>
+            </w:pPr>
+            <w:r>
+              <w:rPr>
+                <w:rFonts w:ascii="Times New Roman" w:cs="Times New Roman" w:eastAsia="Times New Roman" w:hAnsi="Times New Roman"/>
+                <w:color w:val="1E293B"/>
+                <w:sz w:val="20"/>
+                <w:szCs w:val="20"/>
+              </w:rPr>
+              <w:t xml:space="preserve">RULE-MTG-VENUE-SCHEDULE-CONFLICT</w:t>
+            </w:r>
+          </w:p>
+        </w:tc>
+        <w:tc>
+          <w:tcPr>
+            <w:tcW w:type="dxa" w:w="2600"/>
+            <w:tcBorders>
+              <w:top w:val="single" w:color="CBD5E1" w:sz="4"/>
+              <w:left w:val="single" w:color="CBD5E1" w:sz="4"/>
+              <w:bottom w:val="single" w:color="CBD5E1" w:sz="4"/>
+              <w:right w:val="single" w:color="CBD5E1" w:sz="4"/>
+            </w:tcBorders>
+            <w:shd w:fill="F8FAFC" w:val="clear"/>
+            <w:tcMar>
+              <w:top w:type="dxa" w:w="100"/>
+              <w:left w:type="dxa" w:w="140"/>
+              <w:bottom w:type="dxa" w:w="100"/>
+              <w:right w:type="dxa" w:w="140"/>
+            </w:tcMar>
+          </w:tcPr>
+          <w:p>
+            <w:pPr>
+              <w:spacing w:after="25" w:before="25" w:line="240"/>
+              <w:jc w:val="left"/>
+            </w:pPr>
+            <w:r>
+              <w:rPr>
+                <w:rFonts w:ascii="Times New Roman" w:cs="Times New Roman" w:eastAsia="Times New Roman" w:hAnsi="Times New Roman"/>
+                <w:color w:val="1E293B"/>
+                <w:sz w:val="20"/>
+                <w:szCs w:val="20"/>
+              </w:rPr>
+              <w:t xml:space="preserve">Quy Tắc Kiểm Tra Xung Đột Phòng Họp Vật Lý &amp; Lịch Trình Đại Biểu</w:t>
+            </w:r>
+          </w:p>
+        </w:tc>
+        <w:tc>
+          <w:tcPr>
+            <w:tcW w:type="dxa" w:w="5000"/>
+            <w:tcBorders>
+              <w:top w:val="single" w:color="CBD5E1" w:sz="4"/>
+              <w:left w:val="single" w:color="CBD5E1" w:sz="4"/>
+              <w:bottom w:val="single" w:color="CBD5E1" w:sz="4"/>
+              <w:right w:val="single" w:color="CBD5E1" w:sz="4"/>
+            </w:tcBorders>
+            <w:shd w:fill="F8FAFC" w:val="clear"/>
+            <w:tcMar>
+              <w:top w:type="dxa" w:w="100"/>
+              <w:left w:type="dxa" w:w="140"/>
+              <w:bottom w:type="dxa" w:w="100"/>
+              <w:right w:type="dxa" w:w="140"/>
+            </w:tcMar>
+          </w:tcPr>
+          <w:p>
+            <w:pPr>
+              <w:spacing w:after="25" w:before="25" w:line="240"/>
+              <w:jc w:val="left"/>
+            </w:pPr>
+            <w:r>
+              <w:rPr>
+                <w:rFonts w:ascii="Times New Roman" w:cs="Times New Roman" w:eastAsia="Times New Roman" w:hAnsi="Times New Roman"/>
+                <w:color w:val="1E293B"/>
+                <w:sz w:val="20"/>
+                <w:szCs w:val="20"/>
+              </w:rPr>
+              <w:t xml:space="preserve">Áp dụng thuật toán kiểm tra xung đột thời gian và địa điểm cho tất cả các phòng họp vật lý (Sapphire Hub hoặc địa điểm phòng họp tập trung ngoài). Đồng thời, khi lên lịch cuộc họp hoặc mời đại biểu, hệ thống tự động kiểm tra lịch trình của các đại biểu tham gia (`attendees`); nếu phát hiện đại biểu đang có lịch họp trùng khung giờ, hệ thống hiển thị cảnh báo để Ban Thư Ký nắm bắt và chủ động sắp xếp nhân sự.</w:t>
+            </w:r>
+          </w:p>
+        </w:tc>
+      </w:tr>
+      <w:tr>
+        <w:trPr>
+          <w:cantSplit/>
+        </w:trPr>
+        <w:tc>
+          <w:tcPr>
+            <w:tcW w:type="dxa" w:w="1600"/>
+            <w:tcBorders>
+              <w:top w:val="single" w:color="CBD5E1" w:sz="4"/>
+              <w:left w:val="single" w:color="CBD5E1" w:sz="4"/>
+              <w:bottom w:val="single" w:color="CBD5E1" w:sz="4"/>
+              <w:right w:val="single" w:color="CBD5E1" w:sz="4"/>
+            </w:tcBorders>
+            <w:shd w:fill="FFFFFF" w:val="clear"/>
+            <w:tcMar>
+              <w:top w:type="dxa" w:w="100"/>
+              <w:left w:type="dxa" w:w="140"/>
+              <w:bottom w:type="dxa" w:w="100"/>
+              <w:right w:type="dxa" w:w="140"/>
+            </w:tcMar>
+          </w:tcPr>
+          <w:p>
+            <w:pPr>
+              <w:spacing w:after="25" w:before="25" w:line="240"/>
+              <w:jc w:val="left"/>
+            </w:pPr>
+            <w:r>
+              <w:rPr>
+                <w:rFonts w:ascii="Times New Roman" w:cs="Times New Roman" w:eastAsia="Times New Roman" w:hAnsi="Times New Roman"/>
+                <w:color w:val="1E293B"/>
+                <w:sz w:val="20"/>
+                <w:szCs w:val="20"/>
+              </w:rPr>
+              <w:t xml:space="preserve">RULE-RBAC-DEDICATED-MENU-GROUP</w:t>
+            </w:r>
+          </w:p>
+        </w:tc>
+        <w:tc>
+          <w:tcPr>
+            <w:tcW w:type="dxa" w:w="2600"/>
+            <w:tcBorders>
+              <w:top w:val="single" w:color="CBD5E1" w:sz="4"/>
+              <w:left w:val="single" w:color="CBD5E1" w:sz="4"/>
+              <w:bottom w:val="single" w:color="CBD5E1" w:sz="4"/>
+              <w:right w:val="single" w:color="CBD5E1" w:sz="4"/>
+            </w:tcBorders>
+            <w:shd w:fill="FFFFFF" w:val="clear"/>
+            <w:tcMar>
+              <w:top w:type="dxa" w:w="100"/>
+              <w:left w:type="dxa" w:w="140"/>
+              <w:bottom w:type="dxa" w:w="100"/>
+              <w:right w:type="dxa" w:w="140"/>
+            </w:tcMar>
+          </w:tcPr>
+          <w:p>
+            <w:pPr>
+              <w:spacing w:after="25" w:before="25" w:line="240"/>
+              <w:jc w:val="left"/>
+            </w:pPr>
+            <w:r>
+              <w:rPr>
+                <w:rFonts w:ascii="Times New Roman" w:cs="Times New Roman" w:eastAsia="Times New Roman" w:hAnsi="Times New Roman"/>
+                <w:color w:val="1E293B"/>
+                <w:sz w:val="20"/>
+                <w:szCs w:val="20"/>
+              </w:rPr>
+              <w:t xml:space="preserve">Quy Tắc Độc Lập Hóa Nhóm Phân Quyền Vai Trò &amp; Đồng Bộ URL Query</w:t>
+            </w:r>
+          </w:p>
+        </w:tc>
+        <w:tc>
+          <w:tcPr>
+            <w:tcW w:type="dxa" w:w="5000"/>
+            <w:tcBorders>
+              <w:top w:val="single" w:color="CBD5E1" w:sz="4"/>
+              <w:left w:val="single" w:color="CBD5E1" w:sz="4"/>
+              <w:bottom w:val="single" w:color="CBD5E1" w:sz="4"/>
+              <w:right w:val="single" w:color="CBD5E1" w:sz="4"/>
+            </w:tcBorders>
+            <w:shd w:fill="FFFFFF" w:val="clear"/>
+            <w:tcMar>
+              <w:top w:type="dxa" w:w="100"/>
+              <w:left w:type="dxa" w:w="140"/>
+              <w:bottom w:type="dxa" w:w="100"/>
+              <w:right w:type="dxa" w:w="140"/>
+            </w:tcMar>
+          </w:tcPr>
+          <w:p>
+            <w:pPr>
+              <w:spacing w:after="25" w:before="25" w:line="240"/>
+              <w:jc w:val="left"/>
+            </w:pPr>
+            <w:r>
+              <w:rPr>
+                <w:rFonts w:ascii="Times New Roman" w:cs="Times New Roman" w:eastAsia="Times New Roman" w:hAnsi="Times New Roman"/>
+                <w:color w:val="1E293B"/>
+                <w:sz w:val="20"/>
+                <w:szCs w:val="20"/>
+              </w:rPr>
+              <w:t xml:space="preserve">Chức năng Ma Trận Phân Quyền Vai Trò (RBAC Matrix) phải được tách biệt thành một Nhóm Menu Cấp 1 độc lập trên thanh điều hướng Sidebar và Mobile Drawer mang tên 'PHÂN QUYỀN' (`nav.group.permissions`). Màn hình điều khiển `/permissions` hỗ trợ đồng bộ trạng thái Tab hai chiều qua URL Query Parameter (`?tab=matrix`, `?tab=user_actions`, `?tab=role_groups`), đảm bảo khả năng liên kết sâu (deep link) và trải nghiệm tác nghiệp mượt mà cho Quản trị viên.</w:t>
+            </w:r>
+          </w:p>
+        </w:tc>
+      </w:tr>
+      <w:tr>
+        <w:trPr>
+          <w:cantSplit/>
+        </w:trPr>
+        <w:tc>
+          <w:tcPr>
+            <w:tcW w:type="dxa" w:w="1600"/>
+            <w:tcBorders>
+              <w:top w:val="single" w:color="CBD5E1" w:sz="4"/>
+              <w:left w:val="single" w:color="CBD5E1" w:sz="4"/>
+              <w:bottom w:val="single" w:color="CBD5E1" w:sz="4"/>
+              <w:right w:val="single" w:color="CBD5E1" w:sz="4"/>
+            </w:tcBorders>
+            <w:shd w:fill="F8FAFC" w:val="clear"/>
+            <w:tcMar>
+              <w:top w:type="dxa" w:w="100"/>
+              <w:left w:type="dxa" w:w="140"/>
+              <w:bottom w:type="dxa" w:w="100"/>
+              <w:right w:type="dxa" w:w="140"/>
+            </w:tcMar>
+          </w:tcPr>
+          <w:p>
+            <w:pPr>
+              <w:spacing w:after="25" w:before="25" w:line="240"/>
+              <w:jc w:val="left"/>
+            </w:pPr>
+            <w:r>
+              <w:rPr>
+                <w:rFonts w:ascii="Times New Roman" w:cs="Times New Roman" w:eastAsia="Times New Roman" w:hAnsi="Times New Roman"/>
+                <w:color w:val="1E293B"/>
+                <w:sz w:val="20"/>
+                <w:szCs w:val="20"/>
+              </w:rPr>
+              <w:t xml:space="preserve">RULE-AI-32-FEATURES-TWO-PHASE-GPS-GUIDE</w:t>
+            </w:r>
+          </w:p>
+        </w:tc>
+        <w:tc>
+          <w:tcPr>
+            <w:tcW w:type="dxa" w:w="2600"/>
+            <w:tcBorders>
+              <w:top w:val="single" w:color="CBD5E1" w:sz="4"/>
+              <w:left w:val="single" w:color="CBD5E1" w:sz="4"/>
+              <w:bottom w:val="single" w:color="CBD5E1" w:sz="4"/>
+              <w:right w:val="single" w:color="CBD5E1" w:sz="4"/>
+            </w:tcBorders>
+            <w:shd w:fill="F8FAFC" w:val="clear"/>
+            <w:tcMar>
+              <w:top w:type="dxa" w:w="100"/>
+              <w:left w:type="dxa" w:w="140"/>
+              <w:bottom w:type="dxa" w:w="100"/>
+              <w:right w:type="dxa" w:w="140"/>
+            </w:tcMar>
+          </w:tcPr>
+          <w:p>
+            <w:pPr>
+              <w:spacing w:after="25" w:before="25" w:line="240"/>
+              <w:jc w:val="left"/>
+            </w:pPr>
+            <w:r>
+              <w:rPr>
+                <w:rFonts w:ascii="Times New Roman" w:cs="Times New Roman" w:eastAsia="Times New Roman" w:hAnsi="Times New Roman"/>
+                <w:color w:val="1E293B"/>
+                <w:sz w:val="20"/>
+                <w:szCs w:val="20"/>
+              </w:rPr>
+              <w:t xml:space="preserve">Quy Chuẩn Trợ Lý AI Điều Hành 32 Tính Năng &amp; Cơ Chế 2 Pha Chỉ Dẫn Trực Tiếp (Voice GPS Tour Spotlight)</w:t>
+            </w:r>
+          </w:p>
+        </w:tc>
+        <w:tc>
+          <w:tcPr>
+            <w:tcW w:type="dxa" w:w="5000"/>
+            <w:tcBorders>
+              <w:top w:val="single" w:color="CBD5E1" w:sz="4"/>
+              <w:left w:val="single" w:color="CBD5E1" w:sz="4"/>
+              <w:bottom w:val="single" w:color="CBD5E1" w:sz="4"/>
+              <w:right w:val="single" w:color="CBD5E1" w:sz="4"/>
+            </w:tcBorders>
+            <w:shd w:fill="F8FAFC" w:val="clear"/>
+            <w:tcMar>
+              <w:top w:type="dxa" w:w="100"/>
+              <w:left w:type="dxa" w:w="140"/>
+              <w:bottom w:type="dxa" w:w="100"/>
+              <w:right w:type="dxa" w:w="140"/>
+            </w:tcMar>
+          </w:tcPr>
+          <w:p>
+            <w:pPr>
+              <w:spacing w:after="40" w:before="40" w:line="240"/>
+              <w:jc w:val="left"/>
+            </w:pPr>
+            <w:r>
+              <w:rPr>
+                <w:rFonts w:ascii="Times New Roman" w:cs="Times New Roman" w:eastAsia="Times New Roman" w:hAnsi="Times New Roman"/>
+                <w:b/>
+                <w:bCs/>
+                <w:color w:val="003B95"/>
+                <w:sz w:val="20"/>
+                <w:szCs w:val="20"/>
+              </w:rPr>
+              <w:t xml:space="preserve">1) </w:t>
+            </w:r>
+            <w:r>
+              <w:rPr>
+                <w:rFonts w:ascii="Times New Roman" w:cs="Times New Roman" w:eastAsia="Times New Roman" w:hAnsi="Times New Roman"/>
+                <w:color w:val="1E293B"/>
+                <w:sz w:val="20"/>
+                <w:szCs w:val="20"/>
+              </w:rPr>
+              <w:t xml:space="preserve">Nền tảng 100% Miễn Phí: Kết hợp Google Gemini 2.0 Flash Free Tier, Web Speech API vi-VN và Smart Hybrid NLP Engine nội bộ, đảm bảo 0đ chi phí vận hành và tốc độ phản hồi &lt; 400ms. 2) Tự Động Nắm Bắt Phiên Đăng Nhập: Truy vấn dữ liệu thực tế thời gian thực (Hồ sơ cá nhân, Hội phí nợ, Thông báo chưa đọc, Vé sự kiện đã đặt, Top 5 sự kiện đông nhất). 3) Quy Trình Đàm Thoại 2 Pha: Pha 1 giải thích chi tiết các bước thao tác và chủ động hỏi: 'Quý Anh/Chị có muốn tôi hướng dẫn thao tác trực tiếp trên màn hình không?'; Pha 2 khi người dùng bấm 'Có' hoặc nói khẩu lệnh khẳng định ('Có', 'Đồng ý', 'Bắt đầu', 'OK'), hệ thống tự động đóng modal, điều hướng URL đến trang đích và kích hoạt Spotlight viền vàng nhấp nháy dẫn đường từng bước như Google Maps. 4) Ma Trận 32 Tính Năng Toàn Diện: Bao phủ 24 chức năng nội bộ hội viên và 8 chức năng quản trị CRM bên ngoài, không bỏ sót bất kỳ phân hệ nào.</w:t>
             </w:r>
           </w:p>
         </w:tc>
@@ -11481,15 +12518,17 @@
           <w:insideH w:val="single" w:color="auto" w:sz="4"/>
           <w:insideV w:val="single" w:color="auto" w:sz="4"/>
         </w:tblBorders>
+        <w:tblLayout w:type="fixed"/>
       </w:tblPr>
       <w:tblGrid>
-        <w:gridCol w:w="100"/>
-        <w:gridCol w:w="100"/>
-        <w:gridCol w:w="100"/>
-        <w:gridCol w:w="100"/>
+        <w:gridCol w:w="1600"/>
+        <w:gridCol w:w="2400"/>
+        <w:gridCol w:w="2600"/>
+        <w:gridCol w:w="2600"/>
       </w:tblGrid>
       <w:tr>
         <w:trPr>
+          <w:cantSplit/>
           <w:tblHeader/>
         </w:trPr>
         <w:tc>
@@ -11630,6 +12669,9 @@
         </w:tc>
       </w:tr>
       <w:tr>
+        <w:trPr>
+          <w:cantSplit/>
+        </w:trPr>
         <w:tc>
           <w:tcPr>
             <w:tcW w:type="dxa" w:w="1600"/>
@@ -11764,6 +12806,9 @@
         </w:tc>
       </w:tr>
       <w:tr>
+        <w:trPr>
+          <w:cantSplit/>
+        </w:trPr>
         <w:tc>
           <w:tcPr>
             <w:tcW w:type="dxa" w:w="1600"/>
@@ -11793,7 +12838,7 @@
                 <w:sz w:val="20"/>
                 <w:szCs w:val="20"/>
               </w:rPr>
-              <w:t xml:space="preserve">Đăng Nhập Một Chạm (SSO Google / Apple)</w:t>
+              <w:t xml:space="preserve">Trợ Lý AI Điều Hành &amp; Dẫn Đường Thao Tác Trực Tiếp (Turn-by-Turn Voice GPS)</w:t>
             </w:r>
           </w:p>
         </w:tc>
@@ -11826,7 +12871,7 @@
                 <w:sz w:val="20"/>
                 <w:szCs w:val="20"/>
               </w:rPr>
-              <w:t xml:space="preserve">Đăng nhập tức thì chỉ với một chạm qua Google OAuth 2.0 hoặc Apple Sign-In.</w:t>
+              <w:t xml:space="preserve">Người dùng phải đọc tài liệu văn bản tĩnh hoặc xem video hướng dẫn rời rạc, tự tìm kiếm các nút bấm phức tạp trên giao diện.</w:t>
             </w:r>
           </w:p>
         </w:tc>
@@ -11859,7 +12904,7 @@
                 <w:sz w:val="20"/>
                 <w:szCs w:val="20"/>
               </w:rPr>
-              <w:t xml:space="preserve">Đã thiết kế nút bấm UI trên màn hình đăng nhập; chưa cấu hình chính thức Google Client ID và Apple Developer Service ID.</w:t>
+              <w:t xml:space="preserve">Đã tích hợp Trợ lý AI giọng nói tiếng Việt 100% miễn phí (Gemini 2.0 Flash Free Tier + Web Speech API); cơ chế 2 pha đàm thoại thông minh; tự động lái màn hình và chiếu Spotlight viền vàng nhấp nháy vào đúng nút cần thao tác khi người dùng đồng ý.</w:t>
             </w:r>
           </w:p>
         </w:tc>
@@ -11892,12 +12937,15 @@
                 <w:sz w:val="20"/>
                 <w:szCs w:val="20"/>
               </w:rPr>
-              <w:t xml:space="preserve">Hội viên và cán bộ quản lý đăng nhập ổn định bằng Số điện thoại / Email kết hợp Mật khẩu tài khoản cá nhân.</w:t>
+              <w:t xml:space="preserve">Hội viên và cán bộ quản trị chỉ cần mở micro nói khẩu lệnh (ví dụ: 'Đăng ký sự kiện như nào', 'Tạo sự kiện mới kiểu gì', 'Có'), AI tự động giải thích và dẫn đường tận tay.</w:t>
             </w:r>
           </w:p>
         </w:tc>
       </w:tr>
       <w:tr>
+        <w:trPr>
+          <w:cantSplit/>
+        </w:trPr>
         <w:tc>
           <w:tcPr>
             <w:tcW w:type="dxa" w:w="1600"/>
@@ -11927,7 +12975,7 @@
                 <w:sz w:val="20"/>
                 <w:szCs w:val="20"/>
               </w:rPr>
-              <w:t xml:space="preserve">Phòng Họp Trực Tuyến Trực Tiếp (In-app Video Call)</w:t>
+              <w:t xml:space="preserve">Đăng Nhập Một Chạm (SSO Google / Apple)</w:t>
             </w:r>
           </w:p>
         </w:tc>
@@ -11960,7 +13008,7 @@
                 <w:sz w:val="20"/>
                 <w:szCs w:val="20"/>
               </w:rPr>
-              <w:t xml:space="preserve">Nhúng trực tiếp khung hình hội nghị truyền hình WebRTC đa điểm ngay bên trong ứng dụng di động.</w:t>
+              <w:t xml:space="preserve">Đăng nhập tức thì chỉ với một chạm qua Google OAuth 2.0 hoặc Apple Sign-In.</w:t>
             </w:r>
           </w:p>
         </w:tc>
@@ -11993,7 +13041,7 @@
                 <w:sz w:val="20"/>
                 <w:szCs w:val="20"/>
               </w:rPr>
-              <w:t xml:space="preserve">Chưa tích hợp SDK Video Conference trực tiếp vào bundle ứng dụng di động để tối ưu dung lượng tải app.</w:t>
+              <w:t xml:space="preserve">Đã thiết kế nút bấm UI trên màn hình đăng nhập; chưa cấu hình chính thức Google Client ID và Apple Developer Service ID.</w:t>
             </w:r>
           </w:p>
         </w:tc>
@@ -12026,12 +13074,15 @@
                 <w:sz w:val="20"/>
                 <w:szCs w:val="20"/>
               </w:rPr>
-              <w:t xml:space="preserve">Khi đến giờ họp, ứng dụng hiển thị nút mở trực tiếp liên kết phòng họp ngoài (Zoom Meetings, Google Meet hoặc UniWork Platform).</w:t>
+              <w:t xml:space="preserve">Hội viên và cán bộ quản lý đăng nhập ổn định bằng Số điện thoại / Email kết hợp Mật khẩu tài khoản cá nhân.</w:t>
             </w:r>
           </w:p>
         </w:tc>
       </w:tr>
       <w:tr>
+        <w:trPr>
+          <w:cantSplit/>
+        </w:trPr>
         <w:tc>
           <w:tcPr>
             <w:tcW w:type="dxa" w:w="1600"/>
@@ -12061,6 +13112,143 @@
                 <w:sz w:val="20"/>
                 <w:szCs w:val="20"/>
               </w:rPr>
+              <w:t xml:space="preserve">Phòng Họp Trực Tuyến Trực Tiếp (In-app Video Call)</w:t>
+            </w:r>
+          </w:p>
+        </w:tc>
+        <w:tc>
+          <w:tcPr>
+            <w:tcW w:type="dxa" w:w="2400"/>
+            <w:tcBorders>
+              <w:top w:val="single" w:color="CBD5E1" w:sz="4"/>
+              <w:left w:val="single" w:color="CBD5E1" w:sz="4"/>
+              <w:bottom w:val="single" w:color="CBD5E1" w:sz="4"/>
+              <w:right w:val="single" w:color="CBD5E1" w:sz="4"/>
+            </w:tcBorders>
+            <w:shd w:fill="F8FAFC" w:val="clear"/>
+            <w:tcMar>
+              <w:top w:type="dxa" w:w="100"/>
+              <w:left w:type="dxa" w:w="140"/>
+              <w:bottom w:type="dxa" w:w="100"/>
+              <w:right w:type="dxa" w:w="140"/>
+            </w:tcMar>
+          </w:tcPr>
+          <w:p>
+            <w:pPr>
+              <w:spacing w:after="25" w:before="25" w:line="240"/>
+              <w:jc w:val="left"/>
+            </w:pPr>
+            <w:r>
+              <w:rPr>
+                <w:rFonts w:ascii="Times New Roman" w:cs="Times New Roman" w:eastAsia="Times New Roman" w:hAnsi="Times New Roman"/>
+                <w:color w:val="1E293B"/>
+                <w:sz w:val="20"/>
+                <w:szCs w:val="20"/>
+              </w:rPr>
+              <w:t xml:space="preserve">Nhúng trực tiếp khung hình hội nghị truyền hình WebRTC đa điểm ngay bên trong ứng dụng di động.</w:t>
+            </w:r>
+          </w:p>
+        </w:tc>
+        <w:tc>
+          <w:tcPr>
+            <w:tcW w:type="dxa" w:w="2600"/>
+            <w:tcBorders>
+              <w:top w:val="single" w:color="CBD5E1" w:sz="4"/>
+              <w:left w:val="single" w:color="CBD5E1" w:sz="4"/>
+              <w:bottom w:val="single" w:color="CBD5E1" w:sz="4"/>
+              <w:right w:val="single" w:color="CBD5E1" w:sz="4"/>
+            </w:tcBorders>
+            <w:shd w:fill="F8FAFC" w:val="clear"/>
+            <w:tcMar>
+              <w:top w:type="dxa" w:w="100"/>
+              <w:left w:type="dxa" w:w="140"/>
+              <w:bottom w:type="dxa" w:w="100"/>
+              <w:right w:type="dxa" w:w="140"/>
+            </w:tcMar>
+          </w:tcPr>
+          <w:p>
+            <w:pPr>
+              <w:spacing w:after="25" w:before="25" w:line="240"/>
+              <w:jc w:val="left"/>
+            </w:pPr>
+            <w:r>
+              <w:rPr>
+                <w:rFonts w:ascii="Times New Roman" w:cs="Times New Roman" w:eastAsia="Times New Roman" w:hAnsi="Times New Roman"/>
+                <w:color w:val="1E293B"/>
+                <w:sz w:val="20"/>
+                <w:szCs w:val="20"/>
+              </w:rPr>
+              <w:t xml:space="preserve">Chưa tích hợp SDK Video Conference trực tiếp vào bundle ứng dụng di động để tối ưu dung lượng tải app.</w:t>
+            </w:r>
+          </w:p>
+        </w:tc>
+        <w:tc>
+          <w:tcPr>
+            <w:tcW w:type="dxa" w:w="2600"/>
+            <w:tcBorders>
+              <w:top w:val="single" w:color="CBD5E1" w:sz="4"/>
+              <w:left w:val="single" w:color="CBD5E1" w:sz="4"/>
+              <w:bottom w:val="single" w:color="CBD5E1" w:sz="4"/>
+              <w:right w:val="single" w:color="CBD5E1" w:sz="4"/>
+            </w:tcBorders>
+            <w:shd w:fill="F8FAFC" w:val="clear"/>
+            <w:tcMar>
+              <w:top w:type="dxa" w:w="100"/>
+              <w:left w:type="dxa" w:w="140"/>
+              <w:bottom w:type="dxa" w:w="100"/>
+              <w:right w:type="dxa" w:w="140"/>
+            </w:tcMar>
+          </w:tcPr>
+          <w:p>
+            <w:pPr>
+              <w:spacing w:after="25" w:before="25" w:line="240"/>
+              <w:jc w:val="left"/>
+            </w:pPr>
+            <w:r>
+              <w:rPr>
+                <w:rFonts w:ascii="Times New Roman" w:cs="Times New Roman" w:eastAsia="Times New Roman" w:hAnsi="Times New Roman"/>
+                <w:color w:val="1E293B"/>
+                <w:sz w:val="20"/>
+                <w:szCs w:val="20"/>
+              </w:rPr>
+              <w:t xml:space="preserve">Khi đến giờ họp, ứng dụng hiển thị nút mở trực tiếp liên kết phòng họp ngoài (Zoom Meetings, Google Meet hoặc UniWork Platform).</w:t>
+            </w:r>
+          </w:p>
+        </w:tc>
+      </w:tr>
+      <w:tr>
+        <w:trPr>
+          <w:cantSplit/>
+        </w:trPr>
+        <w:tc>
+          <w:tcPr>
+            <w:tcW w:type="dxa" w:w="1600"/>
+            <w:tcBorders>
+              <w:top w:val="single" w:color="CBD5E1" w:sz="4"/>
+              <w:left w:val="single" w:color="CBD5E1" w:sz="4"/>
+              <w:bottom w:val="single" w:color="CBD5E1" w:sz="4"/>
+              <w:right w:val="single" w:color="CBD5E1" w:sz="4"/>
+            </w:tcBorders>
+            <w:shd w:fill="FFFFFF" w:val="clear"/>
+            <w:tcMar>
+              <w:top w:type="dxa" w:w="100"/>
+              <w:left w:type="dxa" w:w="140"/>
+              <w:bottom w:type="dxa" w:w="100"/>
+              <w:right w:type="dxa" w:w="140"/>
+            </w:tcMar>
+          </w:tcPr>
+          <w:p>
+            <w:pPr>
+              <w:spacing w:after="25" w:before="25" w:line="240"/>
+              <w:jc w:val="center"/>
+            </w:pPr>
+            <w:r>
+              <w:rPr>
+                <w:rFonts w:ascii="Times New Roman" w:cs="Times New Roman" w:eastAsia="Times New Roman" w:hAnsi="Times New Roman"/>
+                <w:color w:val="1E293B"/>
+                <w:sz w:val="20"/>
+                <w:szCs w:val="20"/>
+              </w:rPr>
               <w:t xml:space="preserve">Dịch Vụ Tin Nhắn SMS OTP</w:t>
             </w:r>
           </w:p>
@@ -12074,7 +13262,7 @@
               <w:bottom w:val="single" w:color="CBD5E1" w:sz="4"/>
               <w:right w:val="single" w:color="CBD5E1" w:sz="4"/>
             </w:tcBorders>
-            <w:shd w:fill="F8FAFC" w:val="clear"/>
+            <w:shd w:fill="FFFFFF" w:val="clear"/>
             <w:tcMar>
               <w:top w:type="dxa" w:w="100"/>
               <w:left w:type="dxa" w:w="140"/>
@@ -12107,7 +13295,7 @@
               <w:bottom w:val="single" w:color="CBD5E1" w:sz="4"/>
               <w:right w:val="single" w:color="CBD5E1" w:sz="4"/>
             </w:tcBorders>
-            <w:shd w:fill="F8FAFC" w:val="clear"/>
+            <w:shd w:fill="FFFFFF" w:val="clear"/>
             <w:tcMar>
               <w:top w:type="dxa" w:w="100"/>
               <w:left w:type="dxa" w:w="140"/>
@@ -12140,7 +13328,7 @@
               <w:bottom w:val="single" w:color="CBD5E1" w:sz="4"/>
               <w:right w:val="single" w:color="CBD5E1" w:sz="4"/>
             </w:tcBorders>
-            <w:shd w:fill="F8FAFC" w:val="clear"/>
+            <w:shd w:fill="FFFFFF" w:val="clear"/>
             <w:tcMar>
               <w:top w:type="dxa" w:w="100"/>
               <w:left w:type="dxa" w:w="140"/>
@@ -12161,6 +13349,691 @@
                 <w:szCs w:val="20"/>
               </w:rPr>
               <w:t xml:space="preserve">Sử dụng mã OTP mặc định trong môi trường kiểm thử nội bộ hoặc gửi mã kích hoạt trực tiếp qua dịch vụ Thư điện tử SMTP Gmail Relay bảo mật.</w:t>
+            </w:r>
+          </w:p>
+        </w:tc>
+      </w:tr>
+      <w:tr>
+        <w:trPr>
+          <w:cantSplit/>
+        </w:trPr>
+        <w:tc>
+          <w:tcPr>
+            <w:tcW w:type="dxa" w:w="1600"/>
+            <w:tcBorders>
+              <w:top w:val="single" w:color="CBD5E1" w:sz="4"/>
+              <w:left w:val="single" w:color="CBD5E1" w:sz="4"/>
+              <w:bottom w:val="single" w:color="CBD5E1" w:sz="4"/>
+              <w:right w:val="single" w:color="CBD5E1" w:sz="4"/>
+            </w:tcBorders>
+            <w:shd w:fill="F8FAFC" w:val="clear"/>
+            <w:tcMar>
+              <w:top w:type="dxa" w:w="100"/>
+              <w:left w:type="dxa" w:w="140"/>
+              <w:bottom w:type="dxa" w:w="100"/>
+              <w:right w:type="dxa" w:w="140"/>
+            </w:tcMar>
+          </w:tcPr>
+          <w:p>
+            <w:pPr>
+              <w:spacing w:after="25" w:before="25" w:line="240"/>
+              <w:jc w:val="center"/>
+            </w:pPr>
+            <w:r>
+              <w:rPr>
+                <w:rFonts w:ascii="Times New Roman" w:cs="Times New Roman" w:eastAsia="Times New Roman" w:hAnsi="Times New Roman"/>
+                <w:color w:val="1E293B"/>
+                <w:sz w:val="20"/>
+                <w:szCs w:val="20"/>
+              </w:rPr>
+              <w:t xml:space="preserve">Kiểm Soát Xung Đột Địa Điểm Tổ Chức Sự Kiện</w:t>
+            </w:r>
+          </w:p>
+        </w:tc>
+        <w:tc>
+          <w:tcPr>
+            <w:tcW w:type="dxa" w:w="2400"/>
+            <w:tcBorders>
+              <w:top w:val="single" w:color="CBD5E1" w:sz="4"/>
+              <w:left w:val="single" w:color="CBD5E1" w:sz="4"/>
+              <w:bottom w:val="single" w:color="CBD5E1" w:sz="4"/>
+              <w:right w:val="single" w:color="CBD5E1" w:sz="4"/>
+            </w:tcBorders>
+            <w:shd w:fill="F8FAFC" w:val="clear"/>
+            <w:tcMar>
+              <w:top w:type="dxa" w:w="100"/>
+              <w:left w:type="dxa" w:w="140"/>
+              <w:bottom w:type="dxa" w:w="100"/>
+              <w:right w:type="dxa" w:w="140"/>
+            </w:tcMar>
+          </w:tcPr>
+          <w:p>
+            <w:pPr>
+              <w:spacing w:after="25" w:before="25" w:line="240"/>
+              <w:jc w:val="left"/>
+            </w:pPr>
+            <w:r>
+              <w:rPr>
+                <w:rFonts w:ascii="Times New Roman" w:cs="Times New Roman" w:eastAsia="Times New Roman" w:hAnsi="Times New Roman"/>
+                <w:color w:val="1E293B"/>
+                <w:sz w:val="20"/>
+                <w:szCs w:val="20"/>
+              </w:rPr>
+              <w:t xml:space="preserve">Hệ thống chỉ cho phép tạo 1 sự kiện duy nhất trên toàn hiệp hội trong cùng 1 ngày, hoặc không kiểm tra địa điểm dẫn đến 2 sự kiện khác nhau tranh chấp cùng một khán phòng.</w:t>
+            </w:r>
+          </w:p>
+        </w:tc>
+        <w:tc>
+          <w:tcPr>
+            <w:tcW w:type="dxa" w:w="2600"/>
+            <w:tcBorders>
+              <w:top w:val="single" w:color="CBD5E1" w:sz="4"/>
+              <w:left w:val="single" w:color="CBD5E1" w:sz="4"/>
+              <w:bottom w:val="single" w:color="CBD5E1" w:sz="4"/>
+              <w:right w:val="single" w:color="CBD5E1" w:sz="4"/>
+            </w:tcBorders>
+            <w:shd w:fill="F8FAFC" w:val="clear"/>
+            <w:tcMar>
+              <w:top w:type="dxa" w:w="100"/>
+              <w:left w:type="dxa" w:w="140"/>
+              <w:bottom w:type="dxa" w:w="100"/>
+              <w:right w:type="dxa" w:w="140"/>
+            </w:tcMar>
+          </w:tcPr>
+          <w:p>
+            <w:pPr>
+              <w:spacing w:after="25" w:before="25" w:line="240"/>
+              <w:jc w:val="left"/>
+            </w:pPr>
+            <w:r>
+              <w:rPr>
+                <w:rFonts w:ascii="Times New Roman" w:cs="Times New Roman" w:eastAsia="Times New Roman" w:hAnsi="Times New Roman"/>
+                <w:color w:val="1E293B"/>
+                <w:sz w:val="20"/>
+                <w:szCs w:val="20"/>
+              </w:rPr>
+              <w:t xml:space="preserve">Đã chuẩn hóa thuật toán kiểm tra xung đột theo cặp (Thời gian - Địa điểm). Cho phép nhiều sự kiện cùng ngày/giờ nhưng khác địa điểm. Trùng địa điểm sẽ chặn và hiển thị thời gian rảnh dự kiến (+2h).</w:t>
+            </w:r>
+          </w:p>
+        </w:tc>
+        <w:tc>
+          <w:tcPr>
+            <w:tcW w:type="dxa" w:w="2600"/>
+            <w:tcBorders>
+              <w:top w:val="single" w:color="CBD5E1" w:sz="4"/>
+              <w:left w:val="single" w:color="CBD5E1" w:sz="4"/>
+              <w:bottom w:val="single" w:color="CBD5E1" w:sz="4"/>
+              <w:right w:val="single" w:color="CBD5E1" w:sz="4"/>
+            </w:tcBorders>
+            <w:shd w:fill="F8FAFC" w:val="clear"/>
+            <w:tcMar>
+              <w:top w:type="dxa" w:w="100"/>
+              <w:left w:type="dxa" w:w="140"/>
+              <w:bottom w:type="dxa" w:w="100"/>
+              <w:right w:type="dxa" w:w="140"/>
+            </w:tcMar>
+          </w:tcPr>
+          <w:p>
+            <w:pPr>
+              <w:spacing w:after="25" w:before="25" w:line="240"/>
+              <w:jc w:val="left"/>
+            </w:pPr>
+            <w:r>
+              <w:rPr>
+                <w:rFonts w:ascii="Times New Roman" w:cs="Times New Roman" w:eastAsia="Times New Roman" w:hAnsi="Times New Roman"/>
+                <w:color w:val="1E293B"/>
+                <w:sz w:val="20"/>
+                <w:szCs w:val="20"/>
+              </w:rPr>
+              <w:t xml:space="preserve">Backend API `POST /api/association/events` tự động quét các sự kiện active cùng ngày/giờ; nếu trùng địa điểm thì trả về HTTP 409 kèm gợi ý thời gian đăng ký khả dụng.</w:t>
+            </w:r>
+          </w:p>
+        </w:tc>
+      </w:tr>
+      <w:tr>
+        <w:trPr>
+          <w:cantSplit/>
+        </w:trPr>
+        <w:tc>
+          <w:tcPr>
+            <w:tcW w:type="dxa" w:w="1600"/>
+            <w:tcBorders>
+              <w:top w:val="single" w:color="CBD5E1" w:sz="4"/>
+              <w:left w:val="single" w:color="CBD5E1" w:sz="4"/>
+              <w:bottom w:val="single" w:color="CBD5E1" w:sz="4"/>
+              <w:right w:val="single" w:color="CBD5E1" w:sz="4"/>
+            </w:tcBorders>
+            <w:shd w:fill="FFFFFF" w:val="clear"/>
+            <w:tcMar>
+              <w:top w:type="dxa" w:w="100"/>
+              <w:left w:type="dxa" w:w="140"/>
+              <w:bottom w:type="dxa" w:w="100"/>
+              <w:right w:type="dxa" w:w="140"/>
+            </w:tcMar>
+          </w:tcPr>
+          <w:p>
+            <w:pPr>
+              <w:spacing w:after="25" w:before="25" w:line="240"/>
+              <w:jc w:val="center"/>
+            </w:pPr>
+            <w:r>
+              <w:rPr>
+                <w:rFonts w:ascii="Times New Roman" w:cs="Times New Roman" w:eastAsia="Times New Roman" w:hAnsi="Times New Roman"/>
+                <w:color w:val="1E293B"/>
+                <w:sz w:val="20"/>
+                <w:szCs w:val="20"/>
+              </w:rPr>
+              <w:t xml:space="preserve">Cảnh Báo Đăng Ký Sự Kiện Trùng Lịch Hội Viên</w:t>
+            </w:r>
+          </w:p>
+        </w:tc>
+        <w:tc>
+          <w:tcPr>
+            <w:tcW w:type="dxa" w:w="2400"/>
+            <w:tcBorders>
+              <w:top w:val="single" w:color="CBD5E1" w:sz="4"/>
+              <w:left w:val="single" w:color="CBD5E1" w:sz="4"/>
+              <w:bottom w:val="single" w:color="CBD5E1" w:sz="4"/>
+              <w:right w:val="single" w:color="CBD5E1" w:sz="4"/>
+            </w:tcBorders>
+            <w:shd w:fill="FFFFFF" w:val="clear"/>
+            <w:tcMar>
+              <w:top w:type="dxa" w:w="100"/>
+              <w:left w:type="dxa" w:w="140"/>
+              <w:bottom w:type="dxa" w:w="100"/>
+              <w:right w:type="dxa" w:w="140"/>
+            </w:tcMar>
+          </w:tcPr>
+          <w:p>
+            <w:pPr>
+              <w:spacing w:after="25" w:before="25" w:line="240"/>
+              <w:jc w:val="left"/>
+            </w:pPr>
+            <w:r>
+              <w:rPr>
+                <w:rFonts w:ascii="Times New Roman" w:cs="Times New Roman" w:eastAsia="Times New Roman" w:hAnsi="Times New Roman"/>
+                <w:color w:val="1E293B"/>
+                <w:sz w:val="20"/>
+                <w:szCs w:val="20"/>
+              </w:rPr>
+              <w:t xml:space="preserve">Hội viên có thể vô tình hoặc cố ý đăng ký tham dự nhiều sự kiện diễn ra cùng thời gian ở 2 địa điểm khác nhau mà không có bất kỳ cảnh báo nào từ hệ thống.</w:t>
+            </w:r>
+          </w:p>
+        </w:tc>
+        <w:tc>
+          <w:tcPr>
+            <w:tcW w:type="dxa" w:w="2600"/>
+            <w:tcBorders>
+              <w:top w:val="single" w:color="CBD5E1" w:sz="4"/>
+              <w:left w:val="single" w:color="CBD5E1" w:sz="4"/>
+              <w:bottom w:val="single" w:color="CBD5E1" w:sz="4"/>
+              <w:right w:val="single" w:color="CBD5E1" w:sz="4"/>
+            </w:tcBorders>
+            <w:shd w:fill="FFFFFF" w:val="clear"/>
+            <w:tcMar>
+              <w:top w:type="dxa" w:w="100"/>
+              <w:left w:type="dxa" w:w="140"/>
+              <w:bottom w:type="dxa" w:w="100"/>
+              <w:right w:type="dxa" w:w="140"/>
+            </w:tcMar>
+          </w:tcPr>
+          <w:p>
+            <w:pPr>
+              <w:spacing w:after="25" w:before="25" w:line="240"/>
+              <w:jc w:val="left"/>
+            </w:pPr>
+            <w:r>
+              <w:rPr>
+                <w:rFonts w:ascii="Times New Roman" w:cs="Times New Roman" w:eastAsia="Times New Roman" w:hAnsi="Times New Roman"/>
+                <w:color w:val="1E293B"/>
+                <w:sz w:val="20"/>
+                <w:szCs w:val="20"/>
+              </w:rPr>
+              <w:t xml:space="preserve">Giao diện và API đã bổ sung bước xác thực overlap. Hiển thị modal cảnh báo xác nhận rõ tên sự kiện cũ và mới, thời gian trùng lặp; chỉ lưu khi có cờ `confirmOverlap: true`.</w:t>
+            </w:r>
+          </w:p>
+        </w:tc>
+        <w:tc>
+          <w:tcPr>
+            <w:tcW w:type="dxa" w:w="2600"/>
+            <w:tcBorders>
+              <w:top w:val="single" w:color="CBD5E1" w:sz="4"/>
+              <w:left w:val="single" w:color="CBD5E1" w:sz="4"/>
+              <w:bottom w:val="single" w:color="CBD5E1" w:sz="4"/>
+              <w:right w:val="single" w:color="CBD5E1" w:sz="4"/>
+            </w:tcBorders>
+            <w:shd w:fill="FFFFFF" w:val="clear"/>
+            <w:tcMar>
+              <w:top w:type="dxa" w:w="100"/>
+              <w:left w:type="dxa" w:w="140"/>
+              <w:bottom w:type="dxa" w:w="100"/>
+              <w:right w:type="dxa" w:w="140"/>
+            </w:tcMar>
+          </w:tcPr>
+          <w:p>
+            <w:pPr>
+              <w:spacing w:after="25" w:before="25" w:line="240"/>
+              <w:jc w:val="left"/>
+            </w:pPr>
+            <w:r>
+              <w:rPr>
+                <w:rFonts w:ascii="Times New Roman" w:cs="Times New Roman" w:eastAsia="Times New Roman" w:hAnsi="Times New Roman"/>
+                <w:color w:val="1E293B"/>
+                <w:sz w:val="20"/>
+                <w:szCs w:val="20"/>
+              </w:rPr>
+              <w:t xml:space="preserve">Mobile App hiển thị Confirm Dialog giải thích xung đột; khi hội viên bấm 'Tiếp Tục Đăng Ký', API nhận `confirmOverlap = true` để lưu vé hợp lệ.</w:t>
+            </w:r>
+          </w:p>
+        </w:tc>
+      </w:tr>
+      <w:tr>
+        <w:trPr>
+          <w:cantSplit/>
+        </w:trPr>
+        <w:tc>
+          <w:tcPr>
+            <w:tcW w:type="dxa" w:w="1600"/>
+            <w:tcBorders>
+              <w:top w:val="single" w:color="CBD5E1" w:sz="4"/>
+              <w:left w:val="single" w:color="CBD5E1" w:sz="4"/>
+              <w:bottom w:val="single" w:color="CBD5E1" w:sz="4"/>
+              <w:right w:val="single" w:color="CBD5E1" w:sz="4"/>
+            </w:tcBorders>
+            <w:shd w:fill="F8FAFC" w:val="clear"/>
+            <w:tcMar>
+              <w:top w:type="dxa" w:w="100"/>
+              <w:left w:type="dxa" w:w="140"/>
+              <w:bottom w:type="dxa" w:w="100"/>
+              <w:right w:type="dxa" w:w="140"/>
+            </w:tcMar>
+          </w:tcPr>
+          <w:p>
+            <w:pPr>
+              <w:spacing w:after="25" w:before="25" w:line="240"/>
+              <w:jc w:val="center"/>
+            </w:pPr>
+            <w:r>
+              <w:rPr>
+                <w:rFonts w:ascii="Times New Roman" w:cs="Times New Roman" w:eastAsia="Times New Roman" w:hAnsi="Times New Roman"/>
+                <w:color w:val="1E293B"/>
+                <w:sz w:val="20"/>
+                <w:szCs w:val="20"/>
+              </w:rPr>
+              <w:t xml:space="preserve">Vòng Lặp Thử Lại Thư Điện Tử (Google Mailer-Daemon Loop)</w:t>
+            </w:r>
+          </w:p>
+        </w:tc>
+        <w:tc>
+          <w:tcPr>
+            <w:tcW w:type="dxa" w:w="2400"/>
+            <w:tcBorders>
+              <w:top w:val="single" w:color="CBD5E1" w:sz="4"/>
+              <w:left w:val="single" w:color="CBD5E1" w:sz="4"/>
+              <w:bottom w:val="single" w:color="CBD5E1" w:sz="4"/>
+              <w:right w:val="single" w:color="CBD5E1" w:sz="4"/>
+            </w:tcBorders>
+            <w:shd w:fill="F8FAFC" w:val="clear"/>
+            <w:tcMar>
+              <w:top w:type="dxa" w:w="100"/>
+              <w:left w:type="dxa" w:w="140"/>
+              <w:bottom w:type="dxa" w:w="100"/>
+              <w:right w:type="dxa" w:w="140"/>
+            </w:tcMar>
+          </w:tcPr>
+          <w:p>
+            <w:pPr>
+              <w:spacing w:after="25" w:before="25" w:line="240"/>
+              <w:jc w:val="left"/>
+            </w:pPr>
+            <w:r>
+              <w:rPr>
+                <w:rFonts w:ascii="Times New Roman" w:cs="Times New Roman" w:eastAsia="Times New Roman" w:hAnsi="Times New Roman"/>
+                <w:color w:val="1E293B"/>
+                <w:sz w:val="20"/>
+                <w:szCs w:val="20"/>
+              </w:rPr>
+              <w:t xml:space="preserve">Nodemailer cấu hình retry vô hạn hoặc không lọc email test/dummy, dẫn đến việc gửi mail đến hòm thư ảo (@ceo1983.com) bị Google trả về lỗi 550 và kẹt tiến trình suốt 47 giờ.</w:t>
+            </w:r>
+          </w:p>
+        </w:tc>
+        <w:tc>
+          <w:tcPr>
+            <w:tcW w:type="dxa" w:w="2600"/>
+            <w:tcBorders>
+              <w:top w:val="single" w:color="CBD5E1" w:sz="4"/>
+              <w:left w:val="single" w:color="CBD5E1" w:sz="4"/>
+              <w:bottom w:val="single" w:color="CBD5E1" w:sz="4"/>
+              <w:right w:val="single" w:color="CBD5E1" w:sz="4"/>
+            </w:tcBorders>
+            <w:shd w:fill="F8FAFC" w:val="clear"/>
+            <w:tcMar>
+              <w:top w:type="dxa" w:w="100"/>
+              <w:left w:type="dxa" w:w="140"/>
+              <w:bottom w:type="dxa" w:w="100"/>
+              <w:right w:type="dxa" w:w="140"/>
+            </w:tcMar>
+          </w:tcPr>
+          <w:p>
+            <w:pPr>
+              <w:spacing w:after="25" w:before="25" w:line="240"/>
+              <w:jc w:val="left"/>
+            </w:pPr>
+            <w:r>
+              <w:rPr>
+                <w:rFonts w:ascii="Times New Roman" w:cs="Times New Roman" w:eastAsia="Times New Roman" w:hAnsi="Times New Roman"/>
+                <w:color w:val="1E293B"/>
+                <w:sz w:val="20"/>
+                <w:szCs w:val="20"/>
+              </w:rPr>
+              <w:t xml:space="preserve">Đã tích hợp bộ lọc Regex chặn gửi đến miền ảo/test và cơ chế danh sách đen 1-Fail Suppression List (`uploads/mail_suppression_list.json`). Gửi lỗi 1 lần là dừng hẳn.</w:t>
+            </w:r>
+          </w:p>
+        </w:tc>
+        <w:tc>
+          <w:tcPr>
+            <w:tcW w:type="dxa" w:w="2600"/>
+            <w:tcBorders>
+              <w:top w:val="single" w:color="CBD5E1" w:sz="4"/>
+              <w:left w:val="single" w:color="CBD5E1" w:sz="4"/>
+              <w:bottom w:val="single" w:color="CBD5E1" w:sz="4"/>
+              <w:right w:val="single" w:color="CBD5E1" w:sz="4"/>
+            </w:tcBorders>
+            <w:shd w:fill="F8FAFC" w:val="clear"/>
+            <w:tcMar>
+              <w:top w:type="dxa" w:w="100"/>
+              <w:left w:type="dxa" w:w="140"/>
+              <w:bottom w:type="dxa" w:w="100"/>
+              <w:right w:type="dxa" w:w="140"/>
+            </w:tcMar>
+          </w:tcPr>
+          <w:p>
+            <w:pPr>
+              <w:spacing w:after="25" w:before="25" w:line="240"/>
+              <w:jc w:val="left"/>
+            </w:pPr>
+            <w:r>
+              <w:rPr>
+                <w:rFonts w:ascii="Times New Roman" w:cs="Times New Roman" w:eastAsia="Times New Roman" w:hAnsi="Times New Roman"/>
+                <w:color w:val="1E293B"/>
+                <w:sz w:val="20"/>
+                <w:szCs w:val="20"/>
+              </w:rPr>
+              <w:t xml:space="preserve">Dịch vụ `mail.service.ts` kiểm tra suppression list trước khi gửi. Nếu gặp lỗi từ chối, ghi địa chỉ vào file JSON để triệt tiêu hoàn toàn retry.</w:t>
+            </w:r>
+          </w:p>
+        </w:tc>
+      </w:tr>
+      <w:tr>
+        <w:trPr>
+          <w:cantSplit/>
+        </w:trPr>
+        <w:tc>
+          <w:tcPr>
+            <w:tcW w:type="dxa" w:w="1600"/>
+            <w:tcBorders>
+              <w:top w:val="single" w:color="CBD5E1" w:sz="4"/>
+              <w:left w:val="single" w:color="CBD5E1" w:sz="4"/>
+              <w:bottom w:val="single" w:color="CBD5E1" w:sz="4"/>
+              <w:right w:val="single" w:color="CBD5E1" w:sz="4"/>
+            </w:tcBorders>
+            <w:shd w:fill="FFFFFF" w:val="clear"/>
+            <w:tcMar>
+              <w:top w:type="dxa" w:w="100"/>
+              <w:left w:type="dxa" w:w="140"/>
+              <w:bottom w:type="dxa" w:w="100"/>
+              <w:right w:type="dxa" w:w="140"/>
+            </w:tcMar>
+          </w:tcPr>
+          <w:p>
+            <w:pPr>
+              <w:spacing w:after="25" w:before="25" w:line="240"/>
+              <w:jc w:val="center"/>
+            </w:pPr>
+            <w:r>
+              <w:rPr>
+                <w:rFonts w:ascii="Times New Roman" w:cs="Times New Roman" w:eastAsia="Times New Roman" w:hAnsi="Times New Roman"/>
+                <w:color w:val="1E293B"/>
+                <w:sz w:val="20"/>
+                <w:szCs w:val="20"/>
+              </w:rPr>
+              <w:t xml:space="preserve">Kiểm Tra Xung Đột Phòng Họp &amp; Lịch Đại Biểu</w:t>
+            </w:r>
+          </w:p>
+        </w:tc>
+        <w:tc>
+          <w:tcPr>
+            <w:tcW w:type="dxa" w:w="2400"/>
+            <w:tcBorders>
+              <w:top w:val="single" w:color="CBD5E1" w:sz="4"/>
+              <w:left w:val="single" w:color="CBD5E1" w:sz="4"/>
+              <w:bottom w:val="single" w:color="CBD5E1" w:sz="4"/>
+              <w:right w:val="single" w:color="CBD5E1" w:sz="4"/>
+            </w:tcBorders>
+            <w:shd w:fill="FFFFFF" w:val="clear"/>
+            <w:tcMar>
+              <w:top w:type="dxa" w:w="100"/>
+              <w:left w:type="dxa" w:w="140"/>
+              <w:bottom w:type="dxa" w:w="100"/>
+              <w:right w:type="dxa" w:w="140"/>
+            </w:tcMar>
+          </w:tcPr>
+          <w:p>
+            <w:pPr>
+              <w:spacing w:after="25" w:before="25" w:line="240"/>
+              <w:jc w:val="left"/>
+            </w:pPr>
+            <w:r>
+              <w:rPr>
+                <w:rFonts w:ascii="Times New Roman" w:cs="Times New Roman" w:eastAsia="Times New Roman" w:hAnsi="Times New Roman"/>
+                <w:color w:val="1E293B"/>
+                <w:sz w:val="20"/>
+                <w:szCs w:val="20"/>
+              </w:rPr>
+              <w:t xml:space="preserve">Chỉ kiểm tra phòng Sapphire Hub, không kiểm tra các địa điểm họp offline khác và không cảnh báo nếu đại biểu được mời đang có lịch họp trùng khung giờ.</w:t>
+            </w:r>
+          </w:p>
+        </w:tc>
+        <w:tc>
+          <w:tcPr>
+            <w:tcW w:type="dxa" w:w="2600"/>
+            <w:tcBorders>
+              <w:top w:val="single" w:color="CBD5E1" w:sz="4"/>
+              <w:left w:val="single" w:color="CBD5E1" w:sz="4"/>
+              <w:bottom w:val="single" w:color="CBD5E1" w:sz="4"/>
+              <w:right w:val="single" w:color="CBD5E1" w:sz="4"/>
+            </w:tcBorders>
+            <w:shd w:fill="FFFFFF" w:val="clear"/>
+            <w:tcMar>
+              <w:top w:type="dxa" w:w="100"/>
+              <w:left w:type="dxa" w:w="140"/>
+              <w:bottom w:type="dxa" w:w="100"/>
+              <w:right w:type="dxa" w:w="140"/>
+            </w:tcMar>
+          </w:tcPr>
+          <w:p>
+            <w:pPr>
+              <w:spacing w:after="25" w:before="25" w:line="240"/>
+              <w:jc w:val="left"/>
+            </w:pPr>
+            <w:r>
+              <w:rPr>
+                <w:rFonts w:ascii="Times New Roman" w:cs="Times New Roman" w:eastAsia="Times New Roman" w:hAnsi="Times New Roman"/>
+                <w:color w:val="1E293B"/>
+                <w:sz w:val="20"/>
+                <w:szCs w:val="20"/>
+              </w:rPr>
+              <w:t xml:space="preserve">Đã mở rộng kiểm tra mọi địa điểm phòng họp offline; bổ sung kiểm tra xung đột lịch trình của từng đại biểu trong danh sách tham gia cuộc họp.</w:t>
+            </w:r>
+          </w:p>
+        </w:tc>
+        <w:tc>
+          <w:tcPr>
+            <w:tcW w:type="dxa" w:w="2600"/>
+            <w:tcBorders>
+              <w:top w:val="single" w:color="CBD5E1" w:sz="4"/>
+              <w:left w:val="single" w:color="CBD5E1" w:sz="4"/>
+              <w:bottom w:val="single" w:color="CBD5E1" w:sz="4"/>
+              <w:right w:val="single" w:color="CBD5E1" w:sz="4"/>
+            </w:tcBorders>
+            <w:shd w:fill="FFFFFF" w:val="clear"/>
+            <w:tcMar>
+              <w:top w:type="dxa" w:w="100"/>
+              <w:left w:type="dxa" w:w="140"/>
+              <w:bottom w:type="dxa" w:w="100"/>
+              <w:right w:type="dxa" w:w="140"/>
+            </w:tcMar>
+          </w:tcPr>
+          <w:p>
+            <w:pPr>
+              <w:spacing w:after="25" w:before="25" w:line="240"/>
+              <w:jc w:val="left"/>
+            </w:pPr>
+            <w:r>
+              <w:rPr>
+                <w:rFonts w:ascii="Times New Roman" w:cs="Times New Roman" w:eastAsia="Times New Roman" w:hAnsi="Times New Roman"/>
+                <w:color w:val="1E293B"/>
+                <w:sz w:val="20"/>
+                <w:szCs w:val="20"/>
+              </w:rPr>
+              <w:t xml:space="preserve">`meetings.service.ts` kiểm tra cả room physical conflict lẫn attendee conflict; cảnh báo trực quan cho Ban Thư Ký khi lên lịch.</w:t>
+            </w:r>
+          </w:p>
+        </w:tc>
+      </w:tr>
+      <w:tr>
+        <w:trPr>
+          <w:cantSplit/>
+        </w:trPr>
+        <w:tc>
+          <w:tcPr>
+            <w:tcW w:type="dxa" w:w="1600"/>
+            <w:tcBorders>
+              <w:top w:val="single" w:color="CBD5E1" w:sz="4"/>
+              <w:left w:val="single" w:color="CBD5E1" w:sz="4"/>
+              <w:bottom w:val="single" w:color="CBD5E1" w:sz="4"/>
+              <w:right w:val="single" w:color="CBD5E1" w:sz="4"/>
+            </w:tcBorders>
+            <w:shd w:fill="F8FAFC" w:val="clear"/>
+            <w:tcMar>
+              <w:top w:type="dxa" w:w="100"/>
+              <w:left w:type="dxa" w:w="140"/>
+              <w:bottom w:type="dxa" w:w="100"/>
+              <w:right w:type="dxa" w:w="140"/>
+            </w:tcMar>
+          </w:tcPr>
+          <w:p>
+            <w:pPr>
+              <w:spacing w:after="25" w:before="25" w:line="240"/>
+              <w:jc w:val="center"/>
+            </w:pPr>
+            <w:r>
+              <w:rPr>
+                <w:rFonts w:ascii="Times New Roman" w:cs="Times New Roman" w:eastAsia="Times New Roman" w:hAnsi="Times New Roman"/>
+                <w:color w:val="1E293B"/>
+                <w:sz w:val="20"/>
+                <w:szCs w:val="20"/>
+              </w:rPr>
+              <w:t xml:space="preserve">Cấu Trúc Điều Hướng Phân Quyền Quản Trị RBAC</w:t>
+            </w:r>
+          </w:p>
+        </w:tc>
+        <w:tc>
+          <w:tcPr>
+            <w:tcW w:type="dxa" w:w="2400"/>
+            <w:tcBorders>
+              <w:top w:val="single" w:color="CBD5E1" w:sz="4"/>
+              <w:left w:val="single" w:color="CBD5E1" w:sz="4"/>
+              <w:bottom w:val="single" w:color="CBD5E1" w:sz="4"/>
+              <w:right w:val="single" w:color="CBD5E1" w:sz="4"/>
+            </w:tcBorders>
+            <w:shd w:fill="F8FAFC" w:val="clear"/>
+            <w:tcMar>
+              <w:top w:type="dxa" w:w="100"/>
+              <w:left w:type="dxa" w:w="140"/>
+              <w:bottom w:type="dxa" w:w="100"/>
+              <w:right w:type="dxa" w:w="140"/>
+            </w:tcMar>
+          </w:tcPr>
+          <w:p>
+            <w:pPr>
+              <w:spacing w:after="25" w:before="25" w:line="240"/>
+              <w:jc w:val="left"/>
+            </w:pPr>
+            <w:r>
+              <w:rPr>
+                <w:rFonts w:ascii="Times New Roman" w:cs="Times New Roman" w:eastAsia="Times New Roman" w:hAnsi="Times New Roman"/>
+                <w:color w:val="1E293B"/>
+                <w:sz w:val="20"/>
+                <w:szCs w:val="20"/>
+              </w:rPr>
+              <w:t xml:space="preserve">Menu phân quyền bị ẩn sâu bên trong 'Cấu Hình Hệ Thống' chung, khó tìm kiếm và không lưu trạng thái tab trên thanh địa chỉ URL.</w:t>
+            </w:r>
+          </w:p>
+        </w:tc>
+        <w:tc>
+          <w:tcPr>
+            <w:tcW w:type="dxa" w:w="2600"/>
+            <w:tcBorders>
+              <w:top w:val="single" w:color="CBD5E1" w:sz="4"/>
+              <w:left w:val="single" w:color="CBD5E1" w:sz="4"/>
+              <w:bottom w:val="single" w:color="CBD5E1" w:sz="4"/>
+              <w:right w:val="single" w:color="CBD5E1" w:sz="4"/>
+            </w:tcBorders>
+            <w:shd w:fill="F8FAFC" w:val="clear"/>
+            <w:tcMar>
+              <w:top w:type="dxa" w:w="100"/>
+              <w:left w:type="dxa" w:w="140"/>
+              <w:bottom w:type="dxa" w:w="100"/>
+              <w:right w:type="dxa" w:w="140"/>
+            </w:tcMar>
+          </w:tcPr>
+          <w:p>
+            <w:pPr>
+              <w:spacing w:after="25" w:before="25" w:line="240"/>
+              <w:jc w:val="left"/>
+            </w:pPr>
+            <w:r>
+              <w:rPr>
+                <w:rFonts w:ascii="Times New Roman" w:cs="Times New Roman" w:eastAsia="Times New Roman" w:hAnsi="Times New Roman"/>
+                <w:color w:val="1E293B"/>
+                <w:sz w:val="20"/>
+                <w:szCs w:val="20"/>
+              </w:rPr>
+              <w:t xml:space="preserve">Đã tách thành Nhóm Menu riêng 'PHÂN QUYỀN' trên Sidebar và Mobile Drawer. Trang `/permissions` đồng bộ query param `?tab=matrix`, `?tab=user_actions`, `?tab=role_groups`.</w:t>
+            </w:r>
+          </w:p>
+        </w:tc>
+        <w:tc>
+          <w:tcPr>
+            <w:tcW w:type="dxa" w:w="2600"/>
+            <w:tcBorders>
+              <w:top w:val="single" w:color="CBD5E1" w:sz="4"/>
+              <w:left w:val="single" w:color="CBD5E1" w:sz="4"/>
+              <w:bottom w:val="single" w:color="CBD5E1" w:sz="4"/>
+              <w:right w:val="single" w:color="CBD5E1" w:sz="4"/>
+            </w:tcBorders>
+            <w:shd w:fill="F8FAFC" w:val="clear"/>
+            <w:tcMar>
+              <w:top w:type="dxa" w:w="100"/>
+              <w:left w:type="dxa" w:w="140"/>
+              <w:bottom w:type="dxa" w:w="100"/>
+              <w:right w:type="dxa" w:w="140"/>
+            </w:tcMar>
+          </w:tcPr>
+          <w:p>
+            <w:pPr>
+              <w:spacing w:after="25" w:before="25" w:line="240"/>
+              <w:jc w:val="left"/>
+            </w:pPr>
+            <w:r>
+              <w:rPr>
+                <w:rFonts w:ascii="Times New Roman" w:cs="Times New Roman" w:eastAsia="Times New Roman" w:hAnsi="Times New Roman"/>
+                <w:color w:val="1E293B"/>
+                <w:sz w:val="20"/>
+                <w:szCs w:val="20"/>
+              </w:rPr>
+              <w:t xml:space="preserve">Navigation Sidebar bổ sung nhóm `nav.group.permissions`; Route `/permissions` hỗ trợ quản trị viên chia sẻ deep link trực tiếp đến từng tab chức năng.</w:t>
             </w:r>
           </w:p>
         </w:tc>
@@ -12211,13 +14084,15 @@
           <w:insideH w:val="single" w:color="auto" w:sz="4"/>
           <w:insideV w:val="single" w:color="auto" w:sz="4"/>
         </w:tblBorders>
+        <w:tblLayout w:type="fixed"/>
       </w:tblPr>
       <w:tblGrid>
-        <w:gridCol w:w="100"/>
-        <w:gridCol w:w="100"/>
+        <w:gridCol w:w="3500"/>
+        <w:gridCol w:w="5700"/>
       </w:tblGrid>
       <w:tr>
         <w:trPr>
+          <w:cantSplit/>
           <w:tblHeader/>
         </w:trPr>
         <w:tc>
@@ -12290,6 +14165,9 @@
         </w:tc>
       </w:tr>
       <w:tr>
+        <w:trPr>
+          <w:cantSplit/>
+        </w:trPr>
         <w:tc>
           <w:tcPr>
             <w:tcW w:type="dxa" w:w="3500"/>
@@ -12358,6 +14236,9 @@
         </w:tc>
       </w:tr>
       <w:tr>
+        <w:trPr>
+          <w:cantSplit/>
+        </w:trPr>
         <w:tc>
           <w:tcPr>
             <w:tcW w:type="dxa" w:w="3500"/>
@@ -12426,6 +14307,9 @@
         </w:tc>
       </w:tr>
       <w:tr>
+        <w:trPr>
+          <w:cantSplit/>
+        </w:trPr>
         <w:tc>
           <w:tcPr>
             <w:tcW w:type="dxa" w:w="3500"/>
@@ -12494,6 +14378,9 @@
         </w:tc>
       </w:tr>
       <w:tr>
+        <w:trPr>
+          <w:cantSplit/>
+        </w:trPr>
         <w:tc>
           <w:tcPr>
             <w:tcW w:type="dxa" w:w="3500"/>
@@ -12590,13 +14477,15 @@
           <w:insideH w:val="single" w:color="auto" w:sz="4"/>
           <w:insideV w:val="single" w:color="auto" w:sz="4"/>
         </w:tblBorders>
+        <w:tblLayout w:type="fixed"/>
       </w:tblPr>
       <w:tblGrid>
-        <w:gridCol w:w="100"/>
-        <w:gridCol w:w="100"/>
+        <w:gridCol w:w="3500"/>
+        <w:gridCol w:w="5700"/>
       </w:tblGrid>
       <w:tr>
         <w:trPr>
+          <w:cantSplit/>
           <w:tblHeader/>
         </w:trPr>
         <w:tc>
@@ -12669,6 +14558,9 @@
         </w:tc>
       </w:tr>
       <w:tr>
+        <w:trPr>
+          <w:cantSplit/>
+        </w:trPr>
         <w:tc>
           <w:tcPr>
             <w:tcW w:type="dxa" w:w="3500"/>
@@ -12737,6 +14629,9 @@
         </w:tc>
       </w:tr>
       <w:tr>
+        <w:trPr>
+          <w:cantSplit/>
+        </w:trPr>
         <w:tc>
           <w:tcPr>
             <w:tcW w:type="dxa" w:w="3500"/>
@@ -12805,6 +14700,9 @@
         </w:tc>
       </w:tr>
       <w:tr>
+        <w:trPr>
+          <w:cantSplit/>
+        </w:trPr>
         <w:tc>
           <w:tcPr>
             <w:tcW w:type="dxa" w:w="3500"/>
@@ -12873,6 +14771,9 @@
         </w:tc>
       </w:tr>
       <w:tr>
+        <w:trPr>
+          <w:cantSplit/>
+        </w:trPr>
         <w:tc>
           <w:tcPr>
             <w:tcW w:type="dxa" w:w="3500"/>
@@ -12969,13 +14870,15 @@
           <w:insideH w:val="single" w:color="auto" w:sz="4"/>
           <w:insideV w:val="single" w:color="auto" w:sz="4"/>
         </w:tblBorders>
+        <w:tblLayout w:type="fixed"/>
       </w:tblPr>
       <w:tblGrid>
-        <w:gridCol w:w="100"/>
-        <w:gridCol w:w="100"/>
+        <w:gridCol w:w="3500"/>
+        <w:gridCol w:w="5700"/>
       </w:tblGrid>
       <w:tr>
         <w:trPr>
+          <w:cantSplit/>
           <w:tblHeader/>
         </w:trPr>
         <w:tc>
@@ -13048,6 +14951,9 @@
         </w:tc>
       </w:tr>
       <w:tr>
+        <w:trPr>
+          <w:cantSplit/>
+        </w:trPr>
         <w:tc>
           <w:tcPr>
             <w:tcW w:type="dxa" w:w="3500"/>
@@ -13116,6 +15022,9 @@
         </w:tc>
       </w:tr>
       <w:tr>
+        <w:trPr>
+          <w:cantSplit/>
+        </w:trPr>
         <w:tc>
           <w:tcPr>
             <w:tcW w:type="dxa" w:w="3500"/>
@@ -13184,6 +15093,9 @@
         </w:tc>
       </w:tr>
       <w:tr>
+        <w:trPr>
+          <w:cantSplit/>
+        </w:trPr>
         <w:tc>
           <w:tcPr>
             <w:tcW w:type="dxa" w:w="3500"/>
@@ -13280,13 +15192,15 @@
           <w:insideH w:val="single" w:color="auto" w:sz="4"/>
           <w:insideV w:val="single" w:color="auto" w:sz="4"/>
         </w:tblBorders>
+        <w:tblLayout w:type="fixed"/>
       </w:tblPr>
       <w:tblGrid>
-        <w:gridCol w:w="100"/>
-        <w:gridCol w:w="100"/>
+        <w:gridCol w:w="3500"/>
+        <w:gridCol w:w="5700"/>
       </w:tblGrid>
       <w:tr>
         <w:trPr>
+          <w:cantSplit/>
           <w:tblHeader/>
         </w:trPr>
         <w:tc>
@@ -13359,6 +15273,9 @@
         </w:tc>
       </w:tr>
       <w:tr>
+        <w:trPr>
+          <w:cantSplit/>
+        </w:trPr>
         <w:tc>
           <w:tcPr>
             <w:tcW w:type="dxa" w:w="3500"/>
@@ -13427,6 +15344,9 @@
         </w:tc>
       </w:tr>
       <w:tr>
+        <w:trPr>
+          <w:cantSplit/>
+        </w:trPr>
         <w:tc>
           <w:tcPr>
             <w:tcW w:type="dxa" w:w="3500"/>
@@ -13495,6 +15415,9 @@
         </w:tc>
       </w:tr>
       <w:tr>
+        <w:trPr>
+          <w:cantSplit/>
+        </w:trPr>
         <w:tc>
           <w:tcPr>
             <w:tcW w:type="dxa" w:w="3500"/>

</xml_diff>